<commit_message>
Sept 7, update to working copy
</commit_message>
<xml_diff>
--- a/docs/FoS.docx
+++ b/docs/FoS.docx
@@ -23,7 +23,7 @@
         <w:pStyle w:val="Date"/>
       </w:pPr>
       <w:r>
-        <w:t xml:space="preserve">2025-06-24</w:t>
+        <w:t xml:space="preserve">2025-09-06</w:t>
       </w:r>
     </w:p>
     <w:p>
@@ -3180,45 +3180,145 @@
     </w:p>
     <w:p>
       <w:pPr>
-        <w:pStyle w:val="BodyText"/>
-      </w:pPr>
-      <w:r>
-        <w:t xml:space="preserve">The plan: Run partialAccum for a range of storm durations, set hopefully reasonable values for the variables to be held constant, and code up an FoS routine.</w:t>
-      </w:r>
-    </w:p>
-    <w:p>
-      <w:pPr>
         <w:pStyle w:val="SourceCode"/>
       </w:pPr>
       <w:r>
         <w:rPr>
+          <w:rStyle w:val="NormalTok"/>
+        </w:rPr>
+        <w:t xml:space="preserve">gamma_s </w:t>
+      </w:r>
+      <w:r>
+        <w:rPr>
+          <w:rStyle w:val="OtherTok"/>
+        </w:rPr>
+        <w:t xml:space="preserve">&lt;-</w:t>
+      </w:r>
+      <w:r>
+        <w:rPr>
+          <w:rStyle w:val="NormalTok"/>
+        </w:rPr>
+        <w:t xml:space="preserve"> </w:t>
+      </w:r>
+      <w:r>
+        <w:rPr>
+          <w:rStyle w:val="FloatTok"/>
+        </w:rPr>
+        <w:t xml:space="preserve">1.8</w:t>
+      </w:r>
+      <w:r>
+        <w:rPr>
+          <w:rStyle w:val="NormalTok"/>
+        </w:rPr>
+        <w:t xml:space="preserve"> </w:t>
+      </w:r>
+      <w:r>
+        <w:rPr>
+          <w:rStyle w:val="CommentTok"/>
+        </w:rPr>
+        <w:t xml:space="preserve"># unit weight of soil normalized by unit weight of water</w:t>
+      </w:r>
+      <w:r>
+        <w:br/>
+      </w:r>
+      <w:r>
+        <w:rPr>
+          <w:rStyle w:val="NormalTok"/>
+        </w:rPr>
+        <w:t xml:space="preserve">z </w:t>
+      </w:r>
+      <w:r>
+        <w:rPr>
+          <w:rStyle w:val="OtherTok"/>
+        </w:rPr>
+        <w:t xml:space="preserve">&lt;-</w:t>
+      </w:r>
+      <w:r>
+        <w:rPr>
+          <w:rStyle w:val="NormalTok"/>
+        </w:rPr>
+        <w:t xml:space="preserve"> </w:t>
+      </w:r>
+      <w:r>
+        <w:rPr>
           <w:rStyle w:val="FunctionTok"/>
         </w:rPr>
-        <w:t xml:space="preserve">library</w:t>
-      </w:r>
-      <w:r>
-        <w:rPr>
-          <w:rStyle w:val="NormalTok"/>
-        </w:rPr>
-        <w:t xml:space="preserve">(terra)</w:t>
-      </w:r>
-      <w:r>
-        <w:br/>
+        <w:t xml:space="preserve">seq</w:t>
+      </w:r>
+      <w:r>
+        <w:rPr>
+          <w:rStyle w:val="NormalTok"/>
+        </w:rPr>
+        <w:t xml:space="preserve">(</w:t>
+      </w:r>
+      <w:r>
+        <w:rPr>
+          <w:rStyle w:val="AttributeTok"/>
+        </w:rPr>
+        <w:t xml:space="preserve">from=</w:t>
+      </w:r>
+      <w:r>
+        <w:rPr>
+          <w:rStyle w:val="FloatTok"/>
+        </w:rPr>
+        <w:t xml:space="preserve">0.1</w:t>
+      </w:r>
+      <w:r>
+        <w:rPr>
+          <w:rStyle w:val="NormalTok"/>
+        </w:rPr>
+        <w:t xml:space="preserve">, </w:t>
+      </w:r>
+      <w:r>
+        <w:rPr>
+          <w:rStyle w:val="AttributeTok"/>
+        </w:rPr>
+        <w:t xml:space="preserve">to=</w:t>
+      </w:r>
+      <w:r>
+        <w:rPr>
+          <w:rStyle w:val="FloatTok"/>
+        </w:rPr>
+        <w:t xml:space="preserve">1.5</w:t>
+      </w:r>
+      <w:r>
+        <w:rPr>
+          <w:rStyle w:val="NormalTok"/>
+        </w:rPr>
+        <w:t xml:space="preserve">, </w:t>
+      </w:r>
+      <w:r>
+        <w:rPr>
+          <w:rStyle w:val="AttributeTok"/>
+        </w:rPr>
+        <w:t xml:space="preserve">length.out=</w:t>
+      </w:r>
+      <w:r>
+        <w:rPr>
+          <w:rStyle w:val="DecValTok"/>
+        </w:rPr>
+        <w:t xml:space="preserve">100</w:t>
+      </w:r>
+      <w:r>
+        <w:rPr>
+          <w:rStyle w:val="NormalTok"/>
+        </w:rPr>
+        <w:t xml:space="preserve">) </w:t>
       </w:r>
       <w:r>
         <w:rPr>
           <w:rStyle w:val="CommentTok"/>
         </w:rPr>
-        <w:t xml:space="preserve"># Get the FoS raster created with program PartialAccum for a 5-hour-duration storm.</w:t>
-      </w:r>
-      <w:r>
-        <w:br/>
-      </w:r>
-      <w:r>
-        <w:rPr>
-          <w:rStyle w:val="NormalTok"/>
-        </w:rPr>
-        <w:t xml:space="preserve">FoS_pca5 </w:t>
+        <w:t xml:space="preserve"># soil layer depth measured vertically</w:t>
+      </w:r>
+      <w:r>
+        <w:br/>
+      </w:r>
+      <w:r>
+        <w:rPr>
+          <w:rStyle w:val="NormalTok"/>
+        </w:rPr>
+        <w:t xml:space="preserve">tanPhi </w:t>
       </w:r>
       <w:r>
         <w:rPr>
@@ -3230,19 +3330,907 @@
         <w:rPr>
           <w:rStyle w:val="NormalTok"/>
         </w:rPr>
-        <w:t xml:space="preserve"> terra</w:t>
+        <w:t xml:space="preserve"> </w:t>
+      </w:r>
+      <w:r>
+        <w:rPr>
+          <w:rStyle w:val="FloatTok"/>
+        </w:rPr>
+        <w:t xml:space="preserve">0.7</w:t>
+      </w:r>
+      <w:r>
+        <w:br/>
+      </w:r>
+      <w:r>
+        <w:rPr>
+          <w:rStyle w:val="NormalTok"/>
+        </w:rPr>
+        <w:t xml:space="preserve">K </w:t>
+      </w:r>
+      <w:r>
+        <w:rPr>
+          <w:rStyle w:val="OtherTok"/>
+        </w:rPr>
+        <w:t xml:space="preserve">&lt;-</w:t>
+      </w:r>
+      <w:r>
+        <w:rPr>
+          <w:rStyle w:val="NormalTok"/>
+        </w:rPr>
+        <w:t xml:space="preserve"> </w:t>
+      </w:r>
+      <w:r>
+        <w:rPr>
+          <w:rStyle w:val="FloatTok"/>
+        </w:rPr>
+        <w:t xml:space="preserve">1.0</w:t>
+      </w:r>
+      <w:r>
+        <w:br/>
+      </w:r>
+      <w:r>
+        <w:rPr>
+          <w:rStyle w:val="NormalTok"/>
+        </w:rPr>
+        <w:t xml:space="preserve">b </w:t>
+      </w:r>
+      <w:r>
+        <w:rPr>
+          <w:rStyle w:val="OtherTok"/>
+        </w:rPr>
+        <w:t xml:space="preserve">&lt;-</w:t>
+      </w:r>
+      <w:r>
+        <w:rPr>
+          <w:rStyle w:val="NormalTok"/>
+        </w:rPr>
+        <w:t xml:space="preserve"> </w:t>
+      </w:r>
+      <w:r>
+        <w:rPr>
+          <w:rStyle w:val="FloatTok"/>
+        </w:rPr>
+        <w:t xml:space="preserve">1.0</w:t>
+      </w:r>
+      <w:r>
+        <w:br/>
+      </w:r>
+      <w:r>
+        <w:br/>
+      </w:r>
+      <w:r>
+        <w:rPr>
+          <w:rStyle w:val="NormalTok"/>
+        </w:rPr>
+        <w:t xml:space="preserve">tantheta </w:t>
+      </w:r>
+      <w:r>
+        <w:rPr>
+          <w:rStyle w:val="OtherTok"/>
+        </w:rPr>
+        <w:t xml:space="preserve">&lt;-</w:t>
+      </w:r>
+      <w:r>
+        <w:rPr>
+          <w:rStyle w:val="NormalTok"/>
+        </w:rPr>
+        <w:t xml:space="preserve"> </w:t>
+      </w:r>
+      <w:r>
+        <w:rPr>
+          <w:rStyle w:val="FloatTok"/>
+        </w:rPr>
+        <w:t xml:space="preserve">0.7</w:t>
+      </w:r>
+      <w:r>
+        <w:br/>
+      </w:r>
+      <w:r>
+        <w:rPr>
+          <w:rStyle w:val="NormalTok"/>
+        </w:rPr>
+        <w:t xml:space="preserve">theta </w:t>
+      </w:r>
+      <w:r>
+        <w:rPr>
+          <w:rStyle w:val="OtherTok"/>
+        </w:rPr>
+        <w:t xml:space="preserve">&lt;-</w:t>
+      </w:r>
+      <w:r>
+        <w:rPr>
+          <w:rStyle w:val="NormalTok"/>
+        </w:rPr>
+        <w:t xml:space="preserve"> </w:t>
+      </w:r>
+      <w:r>
+        <w:rPr>
+          <w:rStyle w:val="FunctionTok"/>
+        </w:rPr>
+        <w:t xml:space="preserve">atan</w:t>
+      </w:r>
+      <w:r>
+        <w:rPr>
+          <w:rStyle w:val="NormalTok"/>
+        </w:rPr>
+        <w:t xml:space="preserve">(tantheta)</w:t>
+      </w:r>
+      <w:r>
+        <w:br/>
+      </w:r>
+      <w:r>
+        <w:rPr>
+          <w:rStyle w:val="NormalTok"/>
+        </w:rPr>
+        <w:t xml:space="preserve">costheta </w:t>
+      </w:r>
+      <w:r>
+        <w:rPr>
+          <w:rStyle w:val="OtherTok"/>
+        </w:rPr>
+        <w:t xml:space="preserve">&lt;-</w:t>
+      </w:r>
+      <w:r>
+        <w:rPr>
+          <w:rStyle w:val="NormalTok"/>
+        </w:rPr>
+        <w:t xml:space="preserve"> </w:t>
+      </w:r>
+      <w:r>
+        <w:rPr>
+          <w:rStyle w:val="FunctionTok"/>
+        </w:rPr>
+        <w:t xml:space="preserve">cos</w:t>
+      </w:r>
+      <w:r>
+        <w:rPr>
+          <w:rStyle w:val="NormalTok"/>
+        </w:rPr>
+        <w:t xml:space="preserve">(theta)</w:t>
+      </w:r>
+      <w:r>
+        <w:br/>
+      </w:r>
+      <w:r>
+        <w:rPr>
+          <w:rStyle w:val="NormalTok"/>
+        </w:rPr>
+        <w:t xml:space="preserve">sintheta </w:t>
+      </w:r>
+      <w:r>
+        <w:rPr>
+          <w:rStyle w:val="OtherTok"/>
+        </w:rPr>
+        <w:t xml:space="preserve">&lt;-</w:t>
+      </w:r>
+      <w:r>
+        <w:rPr>
+          <w:rStyle w:val="NormalTok"/>
+        </w:rPr>
+        <w:t xml:space="preserve"> </w:t>
+      </w:r>
+      <w:r>
+        <w:rPr>
+          <w:rStyle w:val="FunctionTok"/>
+        </w:rPr>
+        <w:t xml:space="preserve">sin</w:t>
+      </w:r>
+      <w:r>
+        <w:rPr>
+          <w:rStyle w:val="NormalTok"/>
+        </w:rPr>
+        <w:t xml:space="preserve">(theta)</w:t>
+      </w:r>
+      <w:r>
+        <w:br/>
+      </w:r>
+      <w:r>
+        <w:rPr>
+          <w:rStyle w:val="NormalTok"/>
+        </w:rPr>
+        <w:t xml:space="preserve">I </w:t>
+      </w:r>
+      <w:r>
+        <w:rPr>
+          <w:rStyle w:val="OtherTok"/>
+        </w:rPr>
+        <w:t xml:space="preserve">&lt;-</w:t>
+      </w:r>
+      <w:r>
+        <w:rPr>
+          <w:rStyle w:val="NormalTok"/>
+        </w:rPr>
+        <w:t xml:space="preserve"> </w:t>
+      </w:r>
+      <w:r>
+        <w:rPr>
+          <w:rStyle w:val="FloatTok"/>
+        </w:rPr>
+        <w:t xml:space="preserve">0.01</w:t>
+      </w:r>
+      <w:r>
+        <w:br/>
+      </w:r>
+      <w:r>
+        <w:rPr>
+          <w:rStyle w:val="NormalTok"/>
+        </w:rPr>
+        <w:t xml:space="preserve">A </w:t>
+      </w:r>
+      <w:r>
+        <w:rPr>
+          <w:rStyle w:val="OtherTok"/>
+        </w:rPr>
+        <w:t xml:space="preserve">&lt;-</w:t>
+      </w:r>
+      <w:r>
+        <w:rPr>
+          <w:rStyle w:val="NormalTok"/>
+        </w:rPr>
+        <w:t xml:space="preserve"> </w:t>
+      </w:r>
+      <w:r>
+        <w:rPr>
+          <w:rStyle w:val="FloatTok"/>
+        </w:rPr>
+        <w:t xml:space="preserve">5.</w:t>
+      </w:r>
+      <w:r>
+        <w:br/>
+      </w:r>
+      <w:r>
+        <w:rPr>
+          <w:rStyle w:val="NormalTok"/>
+        </w:rPr>
+        <w:t xml:space="preserve">u </w:t>
+      </w:r>
+      <w:r>
+        <w:rPr>
+          <w:rStyle w:val="OtherTok"/>
+        </w:rPr>
+        <w:t xml:space="preserve">&lt;-</w:t>
+      </w:r>
+      <w:r>
+        <w:rPr>
+          <w:rStyle w:val="NormalTok"/>
+        </w:rPr>
+        <w:t xml:space="preserve"> I</w:t>
       </w:r>
       <w:r>
         <w:rPr>
           <w:rStyle w:val="SpecialCharTok"/>
         </w:rPr>
-        <w:t xml:space="preserve">::</w:t>
+        <w:t xml:space="preserve">*</w:t>
+      </w:r>
+      <w:r>
+        <w:rPr>
+          <w:rStyle w:val="NormalTok"/>
+        </w:rPr>
+        <w:t xml:space="preserve">A</w:t>
+      </w:r>
+      <w:r>
+        <w:rPr>
+          <w:rStyle w:val="SpecialCharTok"/>
+        </w:rPr>
+        <w:t xml:space="preserve">/</w:t>
+      </w:r>
+      <w:r>
+        <w:rPr>
+          <w:rStyle w:val="NormalTok"/>
+        </w:rPr>
+        <w:t xml:space="preserve">(K</w:t>
+      </w:r>
+      <w:r>
+        <w:rPr>
+          <w:rStyle w:val="SpecialCharTok"/>
+        </w:rPr>
+        <w:t xml:space="preserve">*</w:t>
+      </w:r>
+      <w:r>
+        <w:rPr>
+          <w:rStyle w:val="NormalTok"/>
+        </w:rPr>
+        <w:t xml:space="preserve">b</w:t>
+      </w:r>
+      <w:r>
+        <w:rPr>
+          <w:rStyle w:val="SpecialCharTok"/>
+        </w:rPr>
+        <w:t xml:space="preserve">*</w:t>
+      </w:r>
+      <w:r>
+        <w:rPr>
+          <w:rStyle w:val="NormalTok"/>
+        </w:rPr>
+        <w:t xml:space="preserve">sintheta</w:t>
+      </w:r>
+      <w:r>
+        <w:rPr>
+          <w:rStyle w:val="SpecialCharTok"/>
+        </w:rPr>
+        <w:t xml:space="preserve">*</w:t>
+      </w:r>
+      <w:r>
+        <w:rPr>
+          <w:rStyle w:val="NormalTok"/>
+        </w:rPr>
+        <w:t xml:space="preserve">costheta)</w:t>
+      </w:r>
+      <w:r>
+        <w:br/>
+      </w:r>
+      <w:r>
+        <w:rPr>
+          <w:rStyle w:val="NormalTok"/>
+        </w:rPr>
+        <w:t xml:space="preserve">FoS1 </w:t>
+      </w:r>
+      <w:r>
+        <w:rPr>
+          <w:rStyle w:val="OtherTok"/>
+        </w:rPr>
+        <w:t xml:space="preserve">&lt;-</w:t>
+      </w:r>
+      <w:r>
+        <w:rPr>
+          <w:rStyle w:val="NormalTok"/>
+        </w:rPr>
+        <w:t xml:space="preserve"> (gamma_s</w:t>
+      </w:r>
+      <w:r>
+        <w:rPr>
+          <w:rStyle w:val="SpecialCharTok"/>
+        </w:rPr>
+        <w:t xml:space="preserve">*</w:t>
+      </w:r>
+      <w:r>
+        <w:rPr>
+          <w:rStyle w:val="NormalTok"/>
+        </w:rPr>
+        <w:t xml:space="preserve">z </w:t>
+      </w:r>
+      <w:r>
+        <w:rPr>
+          <w:rStyle w:val="SpecialCharTok"/>
+        </w:rPr>
+        <w:t xml:space="preserve">-</w:t>
+      </w:r>
+      <w:r>
+        <w:rPr>
+          <w:rStyle w:val="NormalTok"/>
+        </w:rPr>
+        <w:t xml:space="preserve"> u)</w:t>
+      </w:r>
+      <w:r>
+        <w:rPr>
+          <w:rStyle w:val="SpecialCharTok"/>
+        </w:rPr>
+        <w:t xml:space="preserve">*</w:t>
+      </w:r>
+      <w:r>
+        <w:rPr>
+          <w:rStyle w:val="NormalTok"/>
+        </w:rPr>
+        <w:t xml:space="preserve">tanPhi</w:t>
+      </w:r>
+      <w:r>
+        <w:rPr>
+          <w:rStyle w:val="SpecialCharTok"/>
+        </w:rPr>
+        <w:t xml:space="preserve">/</w:t>
+      </w:r>
+      <w:r>
+        <w:rPr>
+          <w:rStyle w:val="NormalTok"/>
+        </w:rPr>
+        <w:t xml:space="preserve">(gamma_s</w:t>
+      </w:r>
+      <w:r>
+        <w:rPr>
+          <w:rStyle w:val="SpecialCharTok"/>
+        </w:rPr>
+        <w:t xml:space="preserve">*</w:t>
+      </w:r>
+      <w:r>
+        <w:rPr>
+          <w:rStyle w:val="NormalTok"/>
+        </w:rPr>
+        <w:t xml:space="preserve">z</w:t>
+      </w:r>
+      <w:r>
+        <w:rPr>
+          <w:rStyle w:val="SpecialCharTok"/>
+        </w:rPr>
+        <w:t xml:space="preserve">*</w:t>
+      </w:r>
+      <w:r>
+        <w:rPr>
+          <w:rStyle w:val="NormalTok"/>
+        </w:rPr>
+        <w:t xml:space="preserve">tantheta)</w:t>
+      </w:r>
+      <w:r>
+        <w:br/>
+      </w:r>
+      <w:r>
+        <w:br/>
+      </w:r>
+      <w:r>
+        <w:rPr>
+          <w:rStyle w:val="NormalTok"/>
+        </w:rPr>
+        <w:t xml:space="preserve">tantheta </w:t>
+      </w:r>
+      <w:r>
+        <w:rPr>
+          <w:rStyle w:val="OtherTok"/>
+        </w:rPr>
+        <w:t xml:space="preserve">&lt;-</w:t>
+      </w:r>
+      <w:r>
+        <w:rPr>
+          <w:rStyle w:val="NormalTok"/>
+        </w:rPr>
+        <w:t xml:space="preserve"> </w:t>
+      </w:r>
+      <w:r>
+        <w:rPr>
+          <w:rStyle w:val="FloatTok"/>
+        </w:rPr>
+        <w:t xml:space="preserve">0.8</w:t>
+      </w:r>
+      <w:r>
+        <w:br/>
+      </w:r>
+      <w:r>
+        <w:rPr>
+          <w:rStyle w:val="NormalTok"/>
+        </w:rPr>
+        <w:t xml:space="preserve">theta </w:t>
+      </w:r>
+      <w:r>
+        <w:rPr>
+          <w:rStyle w:val="OtherTok"/>
+        </w:rPr>
+        <w:t xml:space="preserve">&lt;-</w:t>
+      </w:r>
+      <w:r>
+        <w:rPr>
+          <w:rStyle w:val="NormalTok"/>
+        </w:rPr>
+        <w:t xml:space="preserve"> </w:t>
       </w:r>
       <w:r>
         <w:rPr>
           <w:rStyle w:val="FunctionTok"/>
         </w:rPr>
-        <w:t xml:space="preserve">rast</w:t>
+        <w:t xml:space="preserve">atan</w:t>
+      </w:r>
+      <w:r>
+        <w:rPr>
+          <w:rStyle w:val="NormalTok"/>
+        </w:rPr>
+        <w:t xml:space="preserve">(tantheta)</w:t>
+      </w:r>
+      <w:r>
+        <w:br/>
+      </w:r>
+      <w:r>
+        <w:rPr>
+          <w:rStyle w:val="NormalTok"/>
+        </w:rPr>
+        <w:t xml:space="preserve">costheta </w:t>
+      </w:r>
+      <w:r>
+        <w:rPr>
+          <w:rStyle w:val="OtherTok"/>
+        </w:rPr>
+        <w:t xml:space="preserve">&lt;-</w:t>
+      </w:r>
+      <w:r>
+        <w:rPr>
+          <w:rStyle w:val="NormalTok"/>
+        </w:rPr>
+        <w:t xml:space="preserve"> </w:t>
+      </w:r>
+      <w:r>
+        <w:rPr>
+          <w:rStyle w:val="FunctionTok"/>
+        </w:rPr>
+        <w:t xml:space="preserve">cos</w:t>
+      </w:r>
+      <w:r>
+        <w:rPr>
+          <w:rStyle w:val="NormalTok"/>
+        </w:rPr>
+        <w:t xml:space="preserve">(theta)</w:t>
+      </w:r>
+      <w:r>
+        <w:br/>
+      </w:r>
+      <w:r>
+        <w:rPr>
+          <w:rStyle w:val="NormalTok"/>
+        </w:rPr>
+        <w:t xml:space="preserve">sintheta </w:t>
+      </w:r>
+      <w:r>
+        <w:rPr>
+          <w:rStyle w:val="OtherTok"/>
+        </w:rPr>
+        <w:t xml:space="preserve">&lt;-</w:t>
+      </w:r>
+      <w:r>
+        <w:rPr>
+          <w:rStyle w:val="NormalTok"/>
+        </w:rPr>
+        <w:t xml:space="preserve"> </w:t>
+      </w:r>
+      <w:r>
+        <w:rPr>
+          <w:rStyle w:val="FunctionTok"/>
+        </w:rPr>
+        <w:t xml:space="preserve">sin</w:t>
+      </w:r>
+      <w:r>
+        <w:rPr>
+          <w:rStyle w:val="NormalTok"/>
+        </w:rPr>
+        <w:t xml:space="preserve">(theta)</w:t>
+      </w:r>
+      <w:r>
+        <w:br/>
+      </w:r>
+      <w:r>
+        <w:rPr>
+          <w:rStyle w:val="NormalTok"/>
+        </w:rPr>
+        <w:t xml:space="preserve">I </w:t>
+      </w:r>
+      <w:r>
+        <w:rPr>
+          <w:rStyle w:val="OtherTok"/>
+        </w:rPr>
+        <w:t xml:space="preserve">&lt;-</w:t>
+      </w:r>
+      <w:r>
+        <w:rPr>
+          <w:rStyle w:val="NormalTok"/>
+        </w:rPr>
+        <w:t xml:space="preserve"> </w:t>
+      </w:r>
+      <w:r>
+        <w:rPr>
+          <w:rStyle w:val="FloatTok"/>
+        </w:rPr>
+        <w:t xml:space="preserve">0.01</w:t>
+      </w:r>
+      <w:r>
+        <w:br/>
+      </w:r>
+      <w:r>
+        <w:rPr>
+          <w:rStyle w:val="NormalTok"/>
+        </w:rPr>
+        <w:t xml:space="preserve">A </w:t>
+      </w:r>
+      <w:r>
+        <w:rPr>
+          <w:rStyle w:val="OtherTok"/>
+        </w:rPr>
+        <w:t xml:space="preserve">&lt;-</w:t>
+      </w:r>
+      <w:r>
+        <w:rPr>
+          <w:rStyle w:val="NormalTok"/>
+        </w:rPr>
+        <w:t xml:space="preserve"> </w:t>
+      </w:r>
+      <w:r>
+        <w:rPr>
+          <w:rStyle w:val="FloatTok"/>
+        </w:rPr>
+        <w:t xml:space="preserve">5.</w:t>
+      </w:r>
+      <w:r>
+        <w:br/>
+      </w:r>
+      <w:r>
+        <w:rPr>
+          <w:rStyle w:val="NormalTok"/>
+        </w:rPr>
+        <w:t xml:space="preserve">u </w:t>
+      </w:r>
+      <w:r>
+        <w:rPr>
+          <w:rStyle w:val="OtherTok"/>
+        </w:rPr>
+        <w:t xml:space="preserve">&lt;-</w:t>
+      </w:r>
+      <w:r>
+        <w:rPr>
+          <w:rStyle w:val="NormalTok"/>
+        </w:rPr>
+        <w:t xml:space="preserve"> I</w:t>
+      </w:r>
+      <w:r>
+        <w:rPr>
+          <w:rStyle w:val="SpecialCharTok"/>
+        </w:rPr>
+        <w:t xml:space="preserve">*</w:t>
+      </w:r>
+      <w:r>
+        <w:rPr>
+          <w:rStyle w:val="NormalTok"/>
+        </w:rPr>
+        <w:t xml:space="preserve">A</w:t>
+      </w:r>
+      <w:r>
+        <w:rPr>
+          <w:rStyle w:val="SpecialCharTok"/>
+        </w:rPr>
+        <w:t xml:space="preserve">/</w:t>
+      </w:r>
+      <w:r>
+        <w:rPr>
+          <w:rStyle w:val="NormalTok"/>
+        </w:rPr>
+        <w:t xml:space="preserve">(K</w:t>
+      </w:r>
+      <w:r>
+        <w:rPr>
+          <w:rStyle w:val="SpecialCharTok"/>
+        </w:rPr>
+        <w:t xml:space="preserve">*</w:t>
+      </w:r>
+      <w:r>
+        <w:rPr>
+          <w:rStyle w:val="NormalTok"/>
+        </w:rPr>
+        <w:t xml:space="preserve">b</w:t>
+      </w:r>
+      <w:r>
+        <w:rPr>
+          <w:rStyle w:val="SpecialCharTok"/>
+        </w:rPr>
+        <w:t xml:space="preserve">*</w:t>
+      </w:r>
+      <w:r>
+        <w:rPr>
+          <w:rStyle w:val="NormalTok"/>
+        </w:rPr>
+        <w:t xml:space="preserve">sintheta</w:t>
+      </w:r>
+      <w:r>
+        <w:rPr>
+          <w:rStyle w:val="SpecialCharTok"/>
+        </w:rPr>
+        <w:t xml:space="preserve">*</w:t>
+      </w:r>
+      <w:r>
+        <w:rPr>
+          <w:rStyle w:val="NormalTok"/>
+        </w:rPr>
+        <w:t xml:space="preserve">costheta)</w:t>
+      </w:r>
+      <w:r>
+        <w:br/>
+      </w:r>
+      <w:r>
+        <w:rPr>
+          <w:rStyle w:val="NormalTok"/>
+        </w:rPr>
+        <w:t xml:space="preserve">FoS2 </w:t>
+      </w:r>
+      <w:r>
+        <w:rPr>
+          <w:rStyle w:val="OtherTok"/>
+        </w:rPr>
+        <w:t xml:space="preserve">&lt;-</w:t>
+      </w:r>
+      <w:r>
+        <w:rPr>
+          <w:rStyle w:val="NormalTok"/>
+        </w:rPr>
+        <w:t xml:space="preserve"> (gamma_s</w:t>
+      </w:r>
+      <w:r>
+        <w:rPr>
+          <w:rStyle w:val="SpecialCharTok"/>
+        </w:rPr>
+        <w:t xml:space="preserve">*</w:t>
+      </w:r>
+      <w:r>
+        <w:rPr>
+          <w:rStyle w:val="NormalTok"/>
+        </w:rPr>
+        <w:t xml:space="preserve">z </w:t>
+      </w:r>
+      <w:r>
+        <w:rPr>
+          <w:rStyle w:val="SpecialCharTok"/>
+        </w:rPr>
+        <w:t xml:space="preserve">-</w:t>
+      </w:r>
+      <w:r>
+        <w:rPr>
+          <w:rStyle w:val="NormalTok"/>
+        </w:rPr>
+        <w:t xml:space="preserve"> u)</w:t>
+      </w:r>
+      <w:r>
+        <w:rPr>
+          <w:rStyle w:val="SpecialCharTok"/>
+        </w:rPr>
+        <w:t xml:space="preserve">*</w:t>
+      </w:r>
+      <w:r>
+        <w:rPr>
+          <w:rStyle w:val="NormalTok"/>
+        </w:rPr>
+        <w:t xml:space="preserve">tanPhi</w:t>
+      </w:r>
+      <w:r>
+        <w:rPr>
+          <w:rStyle w:val="SpecialCharTok"/>
+        </w:rPr>
+        <w:t xml:space="preserve">/</w:t>
+      </w:r>
+      <w:r>
+        <w:rPr>
+          <w:rStyle w:val="NormalTok"/>
+        </w:rPr>
+        <w:t xml:space="preserve">(gamma_s</w:t>
+      </w:r>
+      <w:r>
+        <w:rPr>
+          <w:rStyle w:val="SpecialCharTok"/>
+        </w:rPr>
+        <w:t xml:space="preserve">*</w:t>
+      </w:r>
+      <w:r>
+        <w:rPr>
+          <w:rStyle w:val="NormalTok"/>
+        </w:rPr>
+        <w:t xml:space="preserve">z</w:t>
+      </w:r>
+      <w:r>
+        <w:rPr>
+          <w:rStyle w:val="SpecialCharTok"/>
+        </w:rPr>
+        <w:t xml:space="preserve">*</w:t>
+      </w:r>
+      <w:r>
+        <w:rPr>
+          <w:rStyle w:val="NormalTok"/>
+        </w:rPr>
+        <w:t xml:space="preserve">tantheta)</w:t>
+      </w:r>
+      <w:r>
+        <w:br/>
+      </w:r>
+      <w:r>
+        <w:br/>
+      </w:r>
+      <w:r>
+        <w:rPr>
+          <w:rStyle w:val="NormalTok"/>
+        </w:rPr>
+        <w:t xml:space="preserve">FoSdata </w:t>
+      </w:r>
+      <w:r>
+        <w:rPr>
+          <w:rStyle w:val="OtherTok"/>
+        </w:rPr>
+        <w:t xml:space="preserve">&lt;-</w:t>
+      </w:r>
+      <w:r>
+        <w:rPr>
+          <w:rStyle w:val="NormalTok"/>
+        </w:rPr>
+        <w:t xml:space="preserve"> </w:t>
+      </w:r>
+      <w:r>
+        <w:rPr>
+          <w:rStyle w:val="FunctionTok"/>
+        </w:rPr>
+        <w:t xml:space="preserve">data.table</w:t>
+      </w:r>
+      <w:r>
+        <w:rPr>
+          <w:rStyle w:val="NormalTok"/>
+        </w:rPr>
+        <w:t xml:space="preserve">(z,FoS1,FoS2)</w:t>
+      </w:r>
+      <w:r>
+        <w:br/>
+      </w:r>
+      <w:r>
+        <w:rPr>
+          <w:rStyle w:val="NormalTok"/>
+        </w:rPr>
+        <w:t xml:space="preserve">long </w:t>
+      </w:r>
+      <w:r>
+        <w:rPr>
+          <w:rStyle w:val="OtherTok"/>
+        </w:rPr>
+        <w:t xml:space="preserve">&lt;-</w:t>
+      </w:r>
+      <w:r>
+        <w:rPr>
+          <w:rStyle w:val="NormalTok"/>
+        </w:rPr>
+        <w:t xml:space="preserve"> </w:t>
+      </w:r>
+      <w:r>
+        <w:rPr>
+          <w:rStyle w:val="FunctionTok"/>
+        </w:rPr>
+        <w:t xml:space="preserve">melt</w:t>
+      </w:r>
+      <w:r>
+        <w:rPr>
+          <w:rStyle w:val="NormalTok"/>
+        </w:rPr>
+        <w:t xml:space="preserve">(FoSdata, </w:t>
+      </w:r>
+      <w:r>
+        <w:rPr>
+          <w:rStyle w:val="AttributeTok"/>
+        </w:rPr>
+        <w:t xml:space="preserve">id=</w:t>
+      </w:r>
+      <w:r>
+        <w:rPr>
+          <w:rStyle w:val="StringTok"/>
+        </w:rPr>
+        <w:t xml:space="preserve">'z'</w:t>
+      </w:r>
+      <w:r>
+        <w:rPr>
+          <w:rStyle w:val="NormalTok"/>
+        </w:rPr>
+        <w:t xml:space="preserve">)</w:t>
+      </w:r>
+      <w:r>
+        <w:br/>
+      </w:r>
+      <w:r>
+        <w:rPr>
+          <w:rStyle w:val="NormalTok"/>
+        </w:rPr>
+        <w:t xml:space="preserve">thisplot </w:t>
+      </w:r>
+      <w:r>
+        <w:rPr>
+          <w:rStyle w:val="OtherTok"/>
+        </w:rPr>
+        <w:t xml:space="preserve">&lt;-</w:t>
+      </w:r>
+      <w:r>
+        <w:rPr>
+          <w:rStyle w:val="NormalTok"/>
+        </w:rPr>
+        <w:t xml:space="preserve"> </w:t>
+      </w:r>
+      <w:r>
+        <w:rPr>
+          <w:rStyle w:val="FunctionTok"/>
+        </w:rPr>
+        <w:t xml:space="preserve">ggplot</w:t>
+      </w:r>
+      <w:r>
+        <w:rPr>
+          <w:rStyle w:val="NormalTok"/>
+        </w:rPr>
+        <w:t xml:space="preserve">(long, </w:t>
+      </w:r>
+      <w:r>
+        <w:rPr>
+          <w:rStyle w:val="FunctionTok"/>
+        </w:rPr>
+        <w:t xml:space="preserve">aes</w:t>
       </w:r>
       <w:r>
         <w:rPr>
@@ -3252,90 +4240,432 @@
       </w:r>
       <w:r>
         <w:rPr>
+          <w:rStyle w:val="AttributeTok"/>
+        </w:rPr>
+        <w:t xml:space="preserve">x=</w:t>
+      </w:r>
+      <w:r>
+        <w:rPr>
+          <w:rStyle w:val="NormalTok"/>
+        </w:rPr>
+        <w:t xml:space="preserve">z, </w:t>
+      </w:r>
+      <w:r>
+        <w:rPr>
+          <w:rStyle w:val="AttributeTok"/>
+        </w:rPr>
+        <w:t xml:space="preserve">y=</w:t>
+      </w:r>
+      <w:r>
+        <w:rPr>
+          <w:rStyle w:val="NormalTok"/>
+        </w:rPr>
+        <w:t xml:space="preserve">value)) </w:t>
+      </w:r>
+      <w:r>
+        <w:rPr>
+          <w:rStyle w:val="SpecialCharTok"/>
+        </w:rPr>
+        <w:t xml:space="preserve">+</w:t>
+      </w:r>
+      <w:r>
+        <w:rPr>
+          <w:rStyle w:val="NormalTok"/>
+        </w:rPr>
+        <w:t xml:space="preserve"> </w:t>
+      </w:r>
+      <w:r>
+        <w:br/>
+      </w:r>
+      <w:r>
+        <w:rPr>
+          <w:rStyle w:val="NormalTok"/>
+        </w:rPr>
+        <w:t xml:space="preserve">  </w:t>
+      </w:r>
+      <w:r>
+        <w:rPr>
+          <w:rStyle w:val="FunctionTok"/>
+        </w:rPr>
+        <w:t xml:space="preserve">geom_line</w:t>
+      </w:r>
+      <w:r>
+        <w:rPr>
+          <w:rStyle w:val="NormalTok"/>
+        </w:rPr>
+        <w:t xml:space="preserve">(</w:t>
+      </w:r>
+      <w:r>
+        <w:rPr>
+          <w:rStyle w:val="FunctionTok"/>
+        </w:rPr>
+        <w:t xml:space="preserve">aes</w:t>
+      </w:r>
+      <w:r>
+        <w:rPr>
+          <w:rStyle w:val="NormalTok"/>
+        </w:rPr>
+        <w:t xml:space="preserve">(</w:t>
+      </w:r>
+      <w:r>
+        <w:rPr>
+          <w:rStyle w:val="AttributeTok"/>
+        </w:rPr>
+        <w:t xml:space="preserve">colour=</w:t>
+      </w:r>
+      <w:r>
+        <w:rPr>
+          <w:rStyle w:val="NormalTok"/>
+        </w:rPr>
+        <w:t xml:space="preserve">variable)) </w:t>
+      </w:r>
+      <w:r>
+        <w:rPr>
+          <w:rStyle w:val="SpecialCharTok"/>
+        </w:rPr>
+        <w:t xml:space="preserve">+</w:t>
+      </w:r>
+      <w:r>
+        <w:br/>
+      </w:r>
+      <w:r>
+        <w:rPr>
+          <w:rStyle w:val="NormalTok"/>
+        </w:rPr>
+        <w:t xml:space="preserve">  </w:t>
+      </w:r>
+      <w:r>
+        <w:rPr>
+          <w:rStyle w:val="FunctionTok"/>
+        </w:rPr>
+        <w:t xml:space="preserve">labs</w:t>
+      </w:r>
+      <w:r>
+        <w:rPr>
+          <w:rStyle w:val="NormalTok"/>
+        </w:rPr>
+        <w:t xml:space="preserve">(</w:t>
+      </w:r>
+      <w:r>
+        <w:br/>
+      </w:r>
+      <w:r>
+        <w:rPr>
+          <w:rStyle w:val="NormalTok"/>
+        </w:rPr>
+        <w:t xml:space="preserve">    </w:t>
+      </w:r>
+      <w:r>
+        <w:rPr>
+          <w:rStyle w:val="AttributeTok"/>
+        </w:rPr>
+        <w:t xml:space="preserve">x =</w:t>
+      </w:r>
+      <w:r>
+        <w:rPr>
+          <w:rStyle w:val="NormalTok"/>
+        </w:rPr>
+        <w:t xml:space="preserve"> </w:t>
+      </w:r>
+      <w:r>
+        <w:rPr>
           <w:rStyle w:val="StringTok"/>
         </w:rPr>
-        <w:t xml:space="preserve">"c:/work/data/wrangell/fos_pca5.flt"</w:t>
-      </w:r>
-      <w:r>
-        <w:rPr>
-          <w:rStyle w:val="NormalTok"/>
-        </w:rPr>
-        <w:t xml:space="preserve">)</w:t>
-      </w:r>
-      <w:r>
-        <w:br/>
-      </w:r>
-      <w:r>
-        <w:rPr>
-          <w:rStyle w:val="NormalTok"/>
-        </w:rPr>
-        <w:t xml:space="preserve">f </w:t>
-      </w:r>
-      <w:r>
-        <w:rPr>
-          <w:rStyle w:val="OtherTok"/>
-        </w:rPr>
-        <w:t xml:space="preserve">&lt;-</w:t>
-      </w:r>
-      <w:r>
-        <w:rPr>
-          <w:rStyle w:val="NormalTok"/>
-        </w:rPr>
-        <w:t xml:space="preserve"> </w:t>
+        <w:t xml:space="preserve">"z"</w:t>
+      </w:r>
+      <w:r>
+        <w:rPr>
+          <w:rStyle w:val="NormalTok"/>
+        </w:rPr>
+        <w:t xml:space="preserve">,</w:t>
+      </w:r>
+      <w:r>
+        <w:br/>
+      </w:r>
+      <w:r>
+        <w:rPr>
+          <w:rStyle w:val="NormalTok"/>
+        </w:rPr>
+        <w:t xml:space="preserve">    </w:t>
+      </w:r>
+      <w:r>
+        <w:rPr>
+          <w:rStyle w:val="AttributeTok"/>
+        </w:rPr>
+        <w:t xml:space="preserve">y =</w:t>
+      </w:r>
+      <w:r>
+        <w:rPr>
+          <w:rStyle w:val="NormalTok"/>
+        </w:rPr>
+        <w:t xml:space="preserve"> </w:t>
+      </w:r>
+      <w:r>
+        <w:rPr>
+          <w:rStyle w:val="StringTok"/>
+        </w:rPr>
+        <w:t xml:space="preserve">"FoS"</w:t>
+      </w:r>
+      <w:r>
+        <w:rPr>
+          <w:rStyle w:val="NormalTok"/>
+        </w:rPr>
+        <w:t xml:space="preserve">,</w:t>
+      </w:r>
+      <w:r>
+        <w:br/>
+      </w:r>
+      <w:r>
+        <w:rPr>
+          <w:rStyle w:val="NormalTok"/>
+        </w:rPr>
+        <w:t xml:space="preserve">    </w:t>
+      </w:r>
+      <w:r>
+        <w:rPr>
+          <w:rStyle w:val="AttributeTok"/>
+        </w:rPr>
+        <w:t xml:space="preserve">colour =</w:t>
+      </w:r>
+      <w:r>
+        <w:rPr>
+          <w:rStyle w:val="NormalTok"/>
+        </w:rPr>
+        <w:t xml:space="preserve"> </w:t>
+      </w:r>
+      <w:r>
+        <w:rPr>
+          <w:rStyle w:val="StringTok"/>
+        </w:rPr>
+        <w:t xml:space="preserve">"Contributing Area (sq m)"</w:t>
+      </w:r>
+      <w:r>
+        <w:rPr>
+          <w:rStyle w:val="NormalTok"/>
+        </w:rPr>
+        <w:t xml:space="preserve">,</w:t>
+      </w:r>
+      <w:r>
+        <w:br/>
+      </w:r>
+      <w:r>
+        <w:rPr>
+          <w:rStyle w:val="NormalTok"/>
+        </w:rPr>
+        <w:t xml:space="preserve">    </w:t>
+      </w:r>
+      <w:r>
+        <w:rPr>
+          <w:rStyle w:val="AttributeTok"/>
+        </w:rPr>
+        <w:t xml:space="preserve">title =</w:t>
+      </w:r>
+      <w:r>
+        <w:rPr>
+          <w:rStyle w:val="NormalTok"/>
+        </w:rPr>
+        <w:t xml:space="preserve"> </w:t>
+      </w:r>
+      <w:r>
+        <w:rPr>
+          <w:rStyle w:val="StringTok"/>
+        </w:rPr>
+        <w:t xml:space="preserve">"Change of FoS with soil depth"</w:t>
+      </w:r>
+      <w:r>
+        <w:rPr>
+          <w:rStyle w:val="NormalTok"/>
+        </w:rPr>
+        <w:t xml:space="preserve">,</w:t>
+      </w:r>
+      <w:r>
+        <w:br/>
+      </w:r>
+      <w:r>
+        <w:rPr>
+          <w:rStyle w:val="NormalTok"/>
+        </w:rPr>
+        <w:t xml:space="preserve">    </w:t>
+      </w:r>
+      <w:r>
+        <w:rPr>
+          <w:rStyle w:val="AttributeTok"/>
+        </w:rPr>
+        <w:t xml:space="preserve">subtitle =</w:t>
+      </w:r>
+      <w:r>
+        <w:rPr>
+          <w:rStyle w:val="NormalTok"/>
+        </w:rPr>
+        <w:t xml:space="preserve"> </w:t>
+      </w:r>
+      <w:r>
+        <w:rPr>
+          <w:rStyle w:val="StringTok"/>
+        </w:rPr>
+        <w:t xml:space="preserve">"K=1.0, b=1.0, I=0.01"</w:t>
+      </w:r>
+      <w:r>
+        <w:rPr>
+          <w:rStyle w:val="NormalTok"/>
+        </w:rPr>
+        <w:t xml:space="preserve">,</w:t>
+      </w:r>
+      <w:r>
+        <w:br/>
+      </w:r>
+      <w:r>
+        <w:rPr>
+          <w:rStyle w:val="NormalTok"/>
+        </w:rPr>
+        <w:t xml:space="preserve">    </w:t>
+      </w:r>
+      <w:r>
+        <w:rPr>
+          <w:rStyle w:val="AttributeTok"/>
+        </w:rPr>
+        <w:t xml:space="preserve">caption =</w:t>
+      </w:r>
+      <w:r>
+        <w:rPr>
+          <w:rStyle w:val="NormalTok"/>
+        </w:rPr>
+        <w:t xml:space="preserve"> </w:t>
+      </w:r>
+      <w:r>
+        <w:rPr>
+          <w:rStyle w:val="StringTok"/>
+        </w:rPr>
+        <w:t xml:space="preserve">"Increasing slope or contributing area reduces FoS"</w:t>
+      </w:r>
+      <w:r>
+        <w:br/>
+      </w:r>
+      <w:r>
+        <w:rPr>
+          <w:rStyle w:val="NormalTok"/>
+        </w:rPr>
+        <w:t xml:space="preserve">  ) </w:t>
+      </w:r>
+      <w:r>
+        <w:rPr>
+          <w:rStyle w:val="SpecialCharTok"/>
+        </w:rPr>
+        <w:t xml:space="preserve">+</w:t>
+      </w:r>
+      <w:r>
+        <w:br/>
+      </w:r>
+      <w:r>
+        <w:rPr>
+          <w:rStyle w:val="NormalTok"/>
+        </w:rPr>
+        <w:t xml:space="preserve">  </w:t>
       </w:r>
       <w:r>
         <w:rPr>
           <w:rStyle w:val="FunctionTok"/>
         </w:rPr>
-        <w:t xml:space="preserve">as.data.table</w:t>
-      </w:r>
-      <w:r>
-        <w:rPr>
-          <w:rStyle w:val="NormalTok"/>
-        </w:rPr>
-        <w:t xml:space="preserve">(FoS_pca5) </w:t>
-      </w:r>
-      <w:r>
-        <w:br/>
-      </w:r>
-      <w:r>
-        <w:rPr>
-          <w:rStyle w:val="CommentTok"/>
-        </w:rPr>
-        <w:t xml:space="preserve"># Get the FoS values at the inventoried initiation points</w:t>
-      </w:r>
-      <w:r>
-        <w:br/>
-      </w:r>
-      <w:r>
-        <w:rPr>
-          <w:rStyle w:val="NormalTok"/>
-        </w:rPr>
-        <w:t xml:space="preserve">pnts </w:t>
-      </w:r>
-      <w:r>
-        <w:rPr>
-          <w:rStyle w:val="OtherTok"/>
-        </w:rPr>
-        <w:t xml:space="preserve">&lt;-</w:t>
-      </w:r>
-      <w:r>
-        <w:rPr>
-          <w:rStyle w:val="NormalTok"/>
-        </w:rPr>
-        <w:t xml:space="preserve"> terra</w:t>
+        <w:t xml:space="preserve">theme</w:t>
+      </w:r>
+      <w:r>
+        <w:rPr>
+          <w:rStyle w:val="NormalTok"/>
+        </w:rPr>
+        <w:t xml:space="preserve">(</w:t>
+      </w:r>
+      <w:r>
+        <w:rPr>
+          <w:rStyle w:val="AttributeTok"/>
+        </w:rPr>
+        <w:t xml:space="preserve">legend.position =</w:t>
+      </w:r>
+      <w:r>
+        <w:rPr>
+          <w:rStyle w:val="NormalTok"/>
+        </w:rPr>
+        <w:t xml:space="preserve"> </w:t>
+      </w:r>
+      <w:r>
+        <w:rPr>
+          <w:rStyle w:val="StringTok"/>
+        </w:rPr>
+        <w:t xml:space="preserve">"inside"</w:t>
+      </w:r>
+      <w:r>
+        <w:rPr>
+          <w:rStyle w:val="NormalTok"/>
+        </w:rPr>
+        <w:t xml:space="preserve">, </w:t>
+      </w:r>
+      <w:r>
+        <w:rPr>
+          <w:rStyle w:val="AttributeTok"/>
+        </w:rPr>
+        <w:t xml:space="preserve">legend.position.inside =</w:t>
+      </w:r>
+      <w:r>
+        <w:rPr>
+          <w:rStyle w:val="NormalTok"/>
+        </w:rPr>
+        <w:t xml:space="preserve"> </w:t>
+      </w:r>
+      <w:r>
+        <w:rPr>
+          <w:rStyle w:val="FunctionTok"/>
+        </w:rPr>
+        <w:t xml:space="preserve">c</w:t>
+      </w:r>
+      <w:r>
+        <w:rPr>
+          <w:rStyle w:val="NormalTok"/>
+        </w:rPr>
+        <w:t xml:space="preserve">(</w:t>
+      </w:r>
+      <w:r>
+        <w:rPr>
+          <w:rStyle w:val="FloatTok"/>
+        </w:rPr>
+        <w:t xml:space="preserve">0.8</w:t>
+      </w:r>
+      <w:r>
+        <w:rPr>
+          <w:rStyle w:val="NormalTok"/>
+        </w:rPr>
+        <w:t xml:space="preserve">, </w:t>
+      </w:r>
+      <w:r>
+        <w:rPr>
+          <w:rStyle w:val="FloatTok"/>
+        </w:rPr>
+        <w:t xml:space="preserve">0.2</w:t>
+      </w:r>
+      <w:r>
+        <w:rPr>
+          <w:rStyle w:val="NormalTok"/>
+        </w:rPr>
+        <w:t xml:space="preserve">)) </w:t>
       </w:r>
       <w:r>
         <w:rPr>
           <w:rStyle w:val="SpecialCharTok"/>
         </w:rPr>
-        <w:t xml:space="preserve">::</w:t>
+        <w:t xml:space="preserve">+</w:t>
+      </w:r>
+      <w:r>
+        <w:br/>
+      </w:r>
+      <w:r>
+        <w:rPr>
+          <w:rStyle w:val="NormalTok"/>
+        </w:rPr>
+        <w:t xml:space="preserve">  </w:t>
       </w:r>
       <w:r>
         <w:rPr>
           <w:rStyle w:val="FunctionTok"/>
         </w:rPr>
-        <w:t xml:space="preserve">vect</w:t>
+        <w:t xml:space="preserve">scale_color_discrete</w:t>
       </w:r>
       <w:r>
         <w:rPr>
@@ -3345,845 +4675,66 @@
       </w:r>
       <w:r>
         <w:rPr>
+          <w:rStyle w:val="AttributeTok"/>
+        </w:rPr>
+        <w:t xml:space="preserve">labels =</w:t>
+      </w:r>
+      <w:r>
+        <w:rPr>
+          <w:rStyle w:val="NormalTok"/>
+        </w:rPr>
+        <w:t xml:space="preserve"> </w:t>
+      </w:r>
+      <w:r>
+        <w:rPr>
+          <w:rStyle w:val="FunctionTok"/>
+        </w:rPr>
+        <w:t xml:space="preserve">c</w:t>
+      </w:r>
+      <w:r>
+        <w:rPr>
+          <w:rStyle w:val="NormalTok"/>
+        </w:rPr>
+        <w:t xml:space="preserve">(</w:t>
+      </w:r>
+      <w:r>
+        <w:rPr>
           <w:rStyle w:val="StringTok"/>
         </w:rPr>
-        <w:t xml:space="preserve">"c:/work/data/wrangell/LS_pnts.shp"</w:t>
-      </w:r>
-      <w:r>
-        <w:rPr>
-          <w:rStyle w:val="NormalTok"/>
-        </w:rPr>
-        <w:t xml:space="preserve">)</w:t>
-      </w:r>
-      <w:r>
-        <w:br/>
-      </w:r>
-      <w:r>
-        <w:rPr>
-          <w:rStyle w:val="NormalTok"/>
-        </w:rPr>
-        <w:t xml:space="preserve">ls </w:t>
-      </w:r>
-      <w:r>
-        <w:rPr>
-          <w:rStyle w:val="OtherTok"/>
-        </w:rPr>
-        <w:t xml:space="preserve">&lt;-</w:t>
-      </w:r>
-      <w:r>
-        <w:rPr>
-          <w:rStyle w:val="NormalTok"/>
-        </w:rPr>
-        <w:t xml:space="preserve"> terra</w:t>
-      </w:r>
-      <w:r>
-        <w:rPr>
-          <w:rStyle w:val="SpecialCharTok"/>
-        </w:rPr>
-        <w:t xml:space="preserve">::</w:t>
+        <w:t xml:space="preserve">"70%"</w:t>
+      </w:r>
+      <w:r>
+        <w:rPr>
+          <w:rStyle w:val="NormalTok"/>
+        </w:rPr>
+        <w:t xml:space="preserve">, </w:t>
+      </w:r>
+      <w:r>
+        <w:rPr>
+          <w:rStyle w:val="StringTok"/>
+        </w:rPr>
+        <w:t xml:space="preserve">"80%"</w:t>
+      </w:r>
+      <w:r>
+        <w:rPr>
+          <w:rStyle w:val="NormalTok"/>
+        </w:rPr>
+        <w:t xml:space="preserve">))</w:t>
+      </w:r>
+      <w:r>
+        <w:br/>
       </w:r>
       <w:r>
         <w:rPr>
           <w:rStyle w:val="FunctionTok"/>
         </w:rPr>
-        <w:t xml:space="preserve">extract</w:t>
-      </w:r>
-      <w:r>
-        <w:rPr>
-          <w:rStyle w:val="NormalTok"/>
-        </w:rPr>
-        <w:t xml:space="preserve">(FoS_pca5,pnts)</w:t>
-      </w:r>
-      <w:r>
-        <w:br/>
-      </w:r>
-      <w:r>
-        <w:rPr>
-          <w:rStyle w:val="CommentTok"/>
-        </w:rPr>
-        <w:t xml:space="preserve"># Filter the raster FoS values to include only those less than the maximum </w:t>
-      </w:r>
-      <w:r>
-        <w:br/>
-      </w:r>
-      <w:r>
-        <w:rPr>
-          <w:rStyle w:val="CommentTok"/>
-        </w:rPr>
-        <w:t xml:space="preserve"># point value.</w:t>
-      </w:r>
-      <w:r>
-        <w:br/>
-      </w:r>
-      <w:r>
-        <w:rPr>
-          <w:rStyle w:val="NormalTok"/>
-        </w:rPr>
-        <w:t xml:space="preserve">maxls </w:t>
-      </w:r>
-      <w:r>
-        <w:rPr>
-          <w:rStyle w:val="OtherTok"/>
-        </w:rPr>
-        <w:t xml:space="preserve">&lt;-</w:t>
-      </w:r>
-      <w:r>
-        <w:rPr>
-          <w:rStyle w:val="NormalTok"/>
-        </w:rPr>
-        <w:t xml:space="preserve"> </w:t>
-      </w:r>
-      <w:r>
-        <w:rPr>
-          <w:rStyle w:val="FunctionTok"/>
-        </w:rPr>
-        <w:t xml:space="preserve">max</w:t>
-      </w:r>
-      <w:r>
-        <w:rPr>
-          <w:rStyle w:val="NormalTok"/>
-        </w:rPr>
-        <w:t xml:space="preserve">(ls</w:t>
-      </w:r>
-      <w:r>
-        <w:rPr>
-          <w:rStyle w:val="SpecialCharTok"/>
-        </w:rPr>
-        <w:t xml:space="preserve">$</w:t>
-      </w:r>
-      <w:r>
-        <w:rPr>
-          <w:rStyle w:val="NormalTok"/>
-        </w:rPr>
-        <w:t xml:space="preserve">fos_pca5)</w:t>
-      </w:r>
-      <w:r>
-        <w:br/>
-      </w:r>
-      <w:r>
-        <w:rPr>
-          <w:rStyle w:val="NormalTok"/>
-        </w:rPr>
-        <w:t xml:space="preserve">fsub </w:t>
-      </w:r>
-      <w:r>
-        <w:rPr>
-          <w:rStyle w:val="OtherTok"/>
-        </w:rPr>
-        <w:t xml:space="preserve">&lt;-</w:t>
-      </w:r>
-      <w:r>
-        <w:rPr>
-          <w:rStyle w:val="NormalTok"/>
-        </w:rPr>
-        <w:t xml:space="preserve"> </w:t>
-      </w:r>
-      <w:r>
-        <w:rPr>
-          <w:rStyle w:val="FunctionTok"/>
-        </w:rPr>
-        <w:t xml:space="preserve">subset</w:t>
-      </w:r>
-      <w:r>
-        <w:rPr>
-          <w:rStyle w:val="NormalTok"/>
-        </w:rPr>
-        <w:t xml:space="preserve">(f, fos_pca5 </w:t>
-      </w:r>
-      <w:r>
-        <w:rPr>
-          <w:rStyle w:val="SpecialCharTok"/>
-        </w:rPr>
-        <w:t xml:space="preserve">&lt;=</w:t>
-      </w:r>
-      <w:r>
-        <w:rPr>
-          <w:rStyle w:val="NormalTok"/>
-        </w:rPr>
-        <w:t xml:space="preserve"> maxls)</w:t>
-      </w:r>
-      <w:r>
-        <w:br/>
-      </w:r>
-      <w:r>
-        <w:rPr>
-          <w:rStyle w:val="NormalTok"/>
-        </w:rPr>
-        <w:t xml:space="preserve">f1 </w:t>
-      </w:r>
-      <w:r>
-        <w:rPr>
-          <w:rStyle w:val="OtherTok"/>
-        </w:rPr>
-        <w:t xml:space="preserve">&lt;-</w:t>
-      </w:r>
-      <w:r>
-        <w:rPr>
-          <w:rStyle w:val="NormalTok"/>
-        </w:rPr>
-        <w:t xml:space="preserve"> </w:t>
-      </w:r>
-      <w:r>
-        <w:rPr>
-          <w:rStyle w:val="FunctionTok"/>
-        </w:rPr>
-        <w:t xml:space="preserve">as.data.table</w:t>
-      </w:r>
-      <w:r>
-        <w:rPr>
-          <w:rStyle w:val="NormalTok"/>
-        </w:rPr>
-        <w:t xml:space="preserve">(fsub)</w:t>
-      </w:r>
-    </w:p>
-    <w:p>
-      <w:pPr>
-        <w:pStyle w:val="SourceCode"/>
-      </w:pPr>
-      <w:r>
-        <w:rPr>
-          <w:rStyle w:val="NormalTok"/>
-        </w:rPr>
-        <w:t xml:space="preserve">p1 </w:t>
-      </w:r>
-      <w:r>
-        <w:rPr>
-          <w:rStyle w:val="OtherTok"/>
-        </w:rPr>
-        <w:t xml:space="preserve">&lt;-</w:t>
-      </w:r>
-      <w:r>
-        <w:rPr>
-          <w:rStyle w:val="NormalTok"/>
-        </w:rPr>
-        <w:t xml:space="preserve"> </w:t>
-      </w:r>
-      <w:r>
-        <w:rPr>
-          <w:rStyle w:val="FunctionTok"/>
-        </w:rPr>
-        <w:t xml:space="preserve">ggplot</w:t>
-      </w:r>
-      <w:r>
-        <w:rPr>
-          <w:rStyle w:val="NormalTok"/>
-        </w:rPr>
-        <w:t xml:space="preserve">() </w:t>
-      </w:r>
-      <w:r>
-        <w:rPr>
-          <w:rStyle w:val="SpecialCharTok"/>
-        </w:rPr>
-        <w:t xml:space="preserve">+</w:t>
-      </w:r>
-      <w:r>
-        <w:rPr>
-          <w:rStyle w:val="NormalTok"/>
-        </w:rPr>
-        <w:t xml:space="preserve"> </w:t>
-      </w:r>
-      <w:r>
-        <w:br/>
-      </w:r>
-      <w:r>
-        <w:rPr>
-          <w:rStyle w:val="NormalTok"/>
-        </w:rPr>
-        <w:t xml:space="preserve">  </w:t>
-      </w:r>
-      <w:r>
-        <w:rPr>
-          <w:rStyle w:val="FunctionTok"/>
-        </w:rPr>
-        <w:t xml:space="preserve">geom_density</w:t>
-      </w:r>
-      <w:r>
-        <w:rPr>
-          <w:rStyle w:val="NormalTok"/>
-        </w:rPr>
-        <w:t xml:space="preserve">(</w:t>
-      </w:r>
-      <w:r>
-        <w:rPr>
-          <w:rStyle w:val="AttributeTok"/>
-        </w:rPr>
-        <w:t xml:space="preserve">data=</w:t>
-      </w:r>
-      <w:r>
-        <w:rPr>
-          <w:rStyle w:val="NormalTok"/>
-        </w:rPr>
-        <w:t xml:space="preserve">f1, </w:t>
-      </w:r>
-      <w:r>
-        <w:rPr>
-          <w:rStyle w:val="FunctionTok"/>
-        </w:rPr>
-        <w:t xml:space="preserve">aes</w:t>
-      </w:r>
-      <w:r>
-        <w:rPr>
-          <w:rStyle w:val="NormalTok"/>
-        </w:rPr>
-        <w:t xml:space="preserve">(</w:t>
-      </w:r>
-      <w:r>
-        <w:rPr>
-          <w:rStyle w:val="AttributeTok"/>
-        </w:rPr>
-        <w:t xml:space="preserve">x=</w:t>
-      </w:r>
-      <w:r>
-        <w:rPr>
-          <w:rStyle w:val="NormalTok"/>
-        </w:rPr>
-        <w:t xml:space="preserve">fos_pca5, </w:t>
-      </w:r>
-      <w:r>
-        <w:rPr>
-          <w:rStyle w:val="AttributeTok"/>
-        </w:rPr>
-        <w:t xml:space="preserve">fill =</w:t>
-      </w:r>
-      <w:r>
-        <w:rPr>
-          <w:rStyle w:val="NormalTok"/>
-        </w:rPr>
-        <w:t xml:space="preserve"> </w:t>
-      </w:r>
-      <w:r>
-        <w:rPr>
-          <w:rStyle w:val="StringTok"/>
-        </w:rPr>
-        <w:t xml:space="preserve">'DEM'</w:t>
-      </w:r>
-      <w:r>
-        <w:rPr>
-          <w:rStyle w:val="NormalTok"/>
-        </w:rPr>
-        <w:t xml:space="preserve">), </w:t>
-      </w:r>
-      <w:r>
-        <w:rPr>
-          <w:rStyle w:val="AttributeTok"/>
-        </w:rPr>
-        <w:t xml:space="preserve">alpha=</w:t>
-      </w:r>
-      <w:r>
-        <w:rPr>
-          <w:rStyle w:val="FloatTok"/>
-        </w:rPr>
-        <w:t xml:space="preserve">0.5</w:t>
-      </w:r>
-      <w:r>
-        <w:rPr>
-          <w:rStyle w:val="NormalTok"/>
-        </w:rPr>
-        <w:t xml:space="preserve">) </w:t>
-      </w:r>
-      <w:r>
-        <w:rPr>
-          <w:rStyle w:val="SpecialCharTok"/>
-        </w:rPr>
-        <w:t xml:space="preserve">+</w:t>
-      </w:r>
-      <w:r>
-        <w:br/>
-      </w:r>
-      <w:r>
-        <w:rPr>
-          <w:rStyle w:val="NormalTok"/>
-        </w:rPr>
-        <w:t xml:space="preserve">  </w:t>
-      </w:r>
-      <w:r>
-        <w:rPr>
-          <w:rStyle w:val="FunctionTok"/>
-        </w:rPr>
-        <w:t xml:space="preserve">geom_density</w:t>
-      </w:r>
-      <w:r>
-        <w:rPr>
-          <w:rStyle w:val="NormalTok"/>
-        </w:rPr>
-        <w:t xml:space="preserve">(</w:t>
-      </w:r>
-      <w:r>
-        <w:rPr>
-          <w:rStyle w:val="AttributeTok"/>
-        </w:rPr>
-        <w:t xml:space="preserve">data=</w:t>
-      </w:r>
-      <w:r>
-        <w:rPr>
-          <w:rStyle w:val="NormalTok"/>
-        </w:rPr>
-        <w:t xml:space="preserve">ls, </w:t>
-      </w:r>
-      <w:r>
-        <w:rPr>
-          <w:rStyle w:val="FunctionTok"/>
-        </w:rPr>
-        <w:t xml:space="preserve">aes</w:t>
-      </w:r>
-      <w:r>
-        <w:rPr>
-          <w:rStyle w:val="NormalTok"/>
-        </w:rPr>
-        <w:t xml:space="preserve">(</w:t>
-      </w:r>
-      <w:r>
-        <w:rPr>
-          <w:rStyle w:val="AttributeTok"/>
-        </w:rPr>
-        <w:t xml:space="preserve">x=</w:t>
-      </w:r>
-      <w:r>
-        <w:rPr>
-          <w:rStyle w:val="NormalTok"/>
-        </w:rPr>
-        <w:t xml:space="preserve">fos_pca5, </w:t>
-      </w:r>
-      <w:r>
-        <w:rPr>
-          <w:rStyle w:val="AttributeTok"/>
-        </w:rPr>
-        <w:t xml:space="preserve">fill =</w:t>
-      </w:r>
-      <w:r>
-        <w:rPr>
-          <w:rStyle w:val="NormalTok"/>
-        </w:rPr>
-        <w:t xml:space="preserve"> </w:t>
-      </w:r>
-      <w:r>
-        <w:rPr>
-          <w:rStyle w:val="StringTok"/>
-        </w:rPr>
-        <w:t xml:space="preserve">'Landslides'</w:t>
-      </w:r>
-      <w:r>
-        <w:rPr>
-          <w:rStyle w:val="NormalTok"/>
-        </w:rPr>
-        <w:t xml:space="preserve">), </w:t>
-      </w:r>
-      <w:r>
-        <w:rPr>
-          <w:rStyle w:val="AttributeTok"/>
-        </w:rPr>
-        <w:t xml:space="preserve">alpha=</w:t>
-      </w:r>
-      <w:r>
-        <w:rPr>
-          <w:rStyle w:val="FloatTok"/>
-        </w:rPr>
-        <w:t xml:space="preserve">0.5</w:t>
-      </w:r>
-      <w:r>
-        <w:rPr>
-          <w:rStyle w:val="NormalTok"/>
-        </w:rPr>
-        <w:t xml:space="preserve">) </w:t>
-      </w:r>
-      <w:r>
-        <w:rPr>
-          <w:rStyle w:val="SpecialCharTok"/>
-        </w:rPr>
-        <w:t xml:space="preserve">+</w:t>
-      </w:r>
-      <w:r>
-        <w:br/>
-      </w:r>
-      <w:r>
-        <w:rPr>
-          <w:rStyle w:val="NormalTok"/>
-        </w:rPr>
-        <w:t xml:space="preserve">  </w:t>
-      </w:r>
-      <w:r>
-        <w:rPr>
-          <w:rStyle w:val="FunctionTok"/>
-        </w:rPr>
-        <w:t xml:space="preserve">scale_fill_manual</w:t>
-      </w:r>
-      <w:r>
-        <w:rPr>
-          <w:rStyle w:val="NormalTok"/>
-        </w:rPr>
-        <w:t xml:space="preserve">(</w:t>
-      </w:r>
-      <w:r>
-        <w:rPr>
-          <w:rStyle w:val="AttributeTok"/>
-        </w:rPr>
-        <w:t xml:space="preserve">name =</w:t>
-      </w:r>
-      <w:r>
-        <w:rPr>
-          <w:rStyle w:val="NormalTok"/>
-        </w:rPr>
-        <w:t xml:space="preserve"> </w:t>
-      </w:r>
-      <w:r>
-        <w:rPr>
-          <w:rStyle w:val="StringTok"/>
-        </w:rPr>
-        <w:t xml:space="preserve">""</w:t>
-      </w:r>
-      <w:r>
-        <w:rPr>
-          <w:rStyle w:val="NormalTok"/>
-        </w:rPr>
-        <w:t xml:space="preserve">, </w:t>
-      </w:r>
-      <w:r>
-        <w:rPr>
-          <w:rStyle w:val="AttributeTok"/>
-        </w:rPr>
-        <w:t xml:space="preserve">values =</w:t>
-      </w:r>
-      <w:r>
-        <w:rPr>
-          <w:rStyle w:val="NormalTok"/>
-        </w:rPr>
-        <w:t xml:space="preserve"> </w:t>
-      </w:r>
-      <w:r>
-        <w:rPr>
-          <w:rStyle w:val="FunctionTok"/>
-        </w:rPr>
-        <w:t xml:space="preserve">c</w:t>
-      </w:r>
-      <w:r>
-        <w:rPr>
-          <w:rStyle w:val="NormalTok"/>
-        </w:rPr>
-        <w:t xml:space="preserve">(</w:t>
-      </w:r>
-      <w:r>
-        <w:rPr>
-          <w:rStyle w:val="AttributeTok"/>
-        </w:rPr>
-        <w:t xml:space="preserve">DEM =</w:t>
-      </w:r>
-      <w:r>
-        <w:rPr>
-          <w:rStyle w:val="NormalTok"/>
-        </w:rPr>
-        <w:t xml:space="preserve"> </w:t>
-      </w:r>
-      <w:r>
-        <w:rPr>
-          <w:rStyle w:val="StringTok"/>
-        </w:rPr>
-        <w:t xml:space="preserve">'blue'</w:t>
-      </w:r>
-      <w:r>
-        <w:rPr>
-          <w:rStyle w:val="NormalTok"/>
-        </w:rPr>
-        <w:t xml:space="preserve">, </w:t>
-      </w:r>
-      <w:r>
-        <w:rPr>
-          <w:rStyle w:val="AttributeTok"/>
-        </w:rPr>
-        <w:t xml:space="preserve">Landslides =</w:t>
-      </w:r>
-      <w:r>
-        <w:rPr>
-          <w:rStyle w:val="NormalTok"/>
-        </w:rPr>
-        <w:t xml:space="preserve"> </w:t>
-      </w:r>
-      <w:r>
-        <w:rPr>
-          <w:rStyle w:val="StringTok"/>
-        </w:rPr>
-        <w:t xml:space="preserve">'red'</w:t>
-      </w:r>
-      <w:r>
-        <w:rPr>
-          <w:rStyle w:val="NormalTok"/>
-        </w:rPr>
-        <w:t xml:space="preserve">)) </w:t>
-      </w:r>
-      <w:r>
-        <w:rPr>
-          <w:rStyle w:val="SpecialCharTok"/>
-        </w:rPr>
-        <w:t xml:space="preserve">+</w:t>
-      </w:r>
-      <w:r>
-        <w:br/>
-      </w:r>
-      <w:r>
-        <w:rPr>
-          <w:rStyle w:val="NormalTok"/>
-        </w:rPr>
-        <w:t xml:space="preserve">  </w:t>
-      </w:r>
-      <w:r>
-        <w:rPr>
-          <w:rStyle w:val="FunctionTok"/>
-        </w:rPr>
-        <w:t xml:space="preserve">labs</w:t>
-      </w:r>
-      <w:r>
-        <w:rPr>
-          <w:rStyle w:val="NormalTok"/>
-        </w:rPr>
-        <w:t xml:space="preserve">(</w:t>
-      </w:r>
-      <w:r>
-        <w:br/>
-      </w:r>
-      <w:r>
-        <w:rPr>
-          <w:rStyle w:val="NormalTok"/>
-        </w:rPr>
-        <w:t xml:space="preserve">    </w:t>
-      </w:r>
-      <w:r>
-        <w:rPr>
-          <w:rStyle w:val="AttributeTok"/>
-        </w:rPr>
-        <w:t xml:space="preserve">x =</w:t>
-      </w:r>
-      <w:r>
-        <w:rPr>
-          <w:rStyle w:val="NormalTok"/>
-        </w:rPr>
-        <w:t xml:space="preserve"> </w:t>
-      </w:r>
-      <w:r>
-        <w:rPr>
-          <w:rStyle w:val="StringTok"/>
-        </w:rPr>
-        <w:t xml:space="preserve">"Factor of Safety"</w:t>
-      </w:r>
-      <w:r>
-        <w:rPr>
-          <w:rStyle w:val="NormalTok"/>
-        </w:rPr>
-        <w:t xml:space="preserve">,</w:t>
-      </w:r>
-      <w:r>
-        <w:br/>
-      </w:r>
-      <w:r>
-        <w:rPr>
-          <w:rStyle w:val="NormalTok"/>
-        </w:rPr>
-        <w:t xml:space="preserve">    </w:t>
-      </w:r>
-      <w:r>
-        <w:rPr>
-          <w:rStyle w:val="AttributeTok"/>
-        </w:rPr>
-        <w:t xml:space="preserve">y =</w:t>
-      </w:r>
-      <w:r>
-        <w:rPr>
-          <w:rStyle w:val="NormalTok"/>
-        </w:rPr>
-        <w:t xml:space="preserve"> </w:t>
-      </w:r>
-      <w:r>
-        <w:rPr>
-          <w:rStyle w:val="StringTok"/>
-        </w:rPr>
-        <w:t xml:space="preserve">"Density"</w:t>
-      </w:r>
-      <w:r>
-        <w:rPr>
-          <w:rStyle w:val="NormalTok"/>
-        </w:rPr>
-        <w:t xml:space="preserve">,</w:t>
-      </w:r>
-      <w:r>
-        <w:br/>
-      </w:r>
-      <w:r>
-        <w:rPr>
-          <w:rStyle w:val="NormalTok"/>
-        </w:rPr>
-        <w:t xml:space="preserve">    </w:t>
-      </w:r>
-      <w:r>
-        <w:rPr>
-          <w:rStyle w:val="AttributeTok"/>
-        </w:rPr>
-        <w:t xml:space="preserve">title =</w:t>
-      </w:r>
-      <w:r>
-        <w:rPr>
-          <w:rStyle w:val="NormalTok"/>
-        </w:rPr>
-        <w:t xml:space="preserve"> </w:t>
-      </w:r>
-      <w:r>
-        <w:rPr>
-          <w:rStyle w:val="StringTok"/>
-        </w:rPr>
-        <w:t xml:space="preserve">"Wrangell"</w:t>
-      </w:r>
-      <w:r>
-        <w:rPr>
-          <w:rStyle w:val="NormalTok"/>
-        </w:rPr>
-        <w:t xml:space="preserve">,</w:t>
-      </w:r>
-      <w:r>
-        <w:br/>
-      </w:r>
-      <w:r>
-        <w:rPr>
-          <w:rStyle w:val="NormalTok"/>
-        </w:rPr>
-        <w:t xml:space="preserve">    </w:t>
-      </w:r>
-      <w:r>
-        <w:rPr>
-          <w:rStyle w:val="AttributeTok"/>
-        </w:rPr>
-        <w:t xml:space="preserve">subtitle =</w:t>
-      </w:r>
-      <w:r>
-        <w:rPr>
-          <w:rStyle w:val="NormalTok"/>
-        </w:rPr>
-        <w:t xml:space="preserve"> </w:t>
-      </w:r>
-      <w:r>
-        <w:rPr>
-          <w:rStyle w:val="StringTok"/>
-        </w:rPr>
-        <w:t xml:space="preserve">"Storm duration = 5hr"</w:t>
-      </w:r>
-      <w:r>
-        <w:rPr>
-          <w:rStyle w:val="NormalTok"/>
-        </w:rPr>
-        <w:t xml:space="preserve">) </w:t>
-      </w:r>
-      <w:r>
-        <w:rPr>
-          <w:rStyle w:val="SpecialCharTok"/>
-        </w:rPr>
-        <w:t xml:space="preserve">+</w:t>
-      </w:r>
-      <w:r>
-        <w:br/>
-      </w:r>
-      <w:r>
-        <w:rPr>
-          <w:rStyle w:val="NormalTok"/>
-        </w:rPr>
-        <w:t xml:space="preserve">  </w:t>
-      </w:r>
-      <w:r>
-        <w:rPr>
-          <w:rStyle w:val="FunctionTok"/>
-        </w:rPr>
-        <w:t xml:space="preserve">theme</w:t>
-      </w:r>
-      <w:r>
-        <w:rPr>
-          <w:rStyle w:val="NormalTok"/>
-        </w:rPr>
-        <w:t xml:space="preserve">(</w:t>
-      </w:r>
-      <w:r>
-        <w:rPr>
-          <w:rStyle w:val="AttributeTok"/>
-        </w:rPr>
-        <w:t xml:space="preserve">legend.position =</w:t>
-      </w:r>
-      <w:r>
-        <w:rPr>
-          <w:rStyle w:val="NormalTok"/>
-        </w:rPr>
-        <w:t xml:space="preserve"> </w:t>
-      </w:r>
-      <w:r>
-        <w:rPr>
-          <w:rStyle w:val="StringTok"/>
-        </w:rPr>
-        <w:t xml:space="preserve">"inside"</w:t>
-      </w:r>
-      <w:r>
-        <w:rPr>
-          <w:rStyle w:val="NormalTok"/>
-        </w:rPr>
-        <w:t xml:space="preserve">, </w:t>
-      </w:r>
-      <w:r>
-        <w:rPr>
-          <w:rStyle w:val="AttributeTok"/>
-        </w:rPr>
-        <w:t xml:space="preserve">legend.position.inside =</w:t>
-      </w:r>
-      <w:r>
-        <w:rPr>
-          <w:rStyle w:val="NormalTok"/>
-        </w:rPr>
-        <w:t xml:space="preserve"> </w:t>
-      </w:r>
-      <w:r>
-        <w:rPr>
-          <w:rStyle w:val="FunctionTok"/>
-        </w:rPr>
-        <w:t xml:space="preserve">c</w:t>
-      </w:r>
-      <w:r>
-        <w:rPr>
-          <w:rStyle w:val="NormalTok"/>
-        </w:rPr>
-        <w:t xml:space="preserve">(</w:t>
-      </w:r>
-      <w:r>
-        <w:rPr>
-          <w:rStyle w:val="FloatTok"/>
-        </w:rPr>
-        <w:t xml:space="preserve">0.6</w:t>
-      </w:r>
-      <w:r>
-        <w:rPr>
-          <w:rStyle w:val="NormalTok"/>
-        </w:rPr>
-        <w:t xml:space="preserve">, </w:t>
-      </w:r>
-      <w:r>
-        <w:rPr>
-          <w:rStyle w:val="FloatTok"/>
-        </w:rPr>
-        <w:t xml:space="preserve">0.8</w:t>
-      </w:r>
-      <w:r>
-        <w:rPr>
-          <w:rStyle w:val="NormalTok"/>
-        </w:rPr>
-        <w:t xml:space="preserve">))</w:t>
-      </w:r>
-      <w:r>
-        <w:br/>
-      </w:r>
-      <w:r>
-        <w:rPr>
-          <w:rStyle w:val="NormalTok"/>
-        </w:rPr>
-        <w:t xml:space="preserve">  </w:t>
-      </w:r>
-      <w:r>
-        <w:br/>
-      </w:r>
-      <w:r>
-        <w:rPr>
-          <w:rStyle w:val="NormalTok"/>
-        </w:rPr>
-        <w:t xml:space="preserve">p1</w:t>
+        <w:t xml:space="preserve">plot</w:t>
+      </w:r>
+      <w:r>
+        <w:rPr>
+          <w:rStyle w:val="NormalTok"/>
+        </w:rPr>
+        <w:t xml:space="preserve">(thisplot)</w:t>
       </w:r>
     </w:p>
     <w:p>
@@ -4200,7 +4751,7 @@
               <a:graphicData uri="http://schemas.openxmlformats.org/drawingml/2006/picture">
                 <pic:pic>
                   <pic:nvPicPr>
-                    <pic:cNvPr descr="FoS_files/figure-docx/unnamed-chunk-3-1.png" id="26" name="Picture"/>
+                    <pic:cNvPr descr="FoS_files/figure-docx/unnamed-chunk-2-1.png" id="26" name="Picture"/>
                     <pic:cNvPicPr>
                       <a:picLocks noChangeArrowheads="1" noChangeAspect="1"/>
                     </pic:cNvPicPr>
@@ -4233,8 +4784,1063 @@
         </w:drawing>
       </w:r>
     </w:p>
-    <w:bookmarkStart w:id="33" w:name="refs"/>
-    <w:bookmarkStart w:id="27" w:name="ref-dietrich2001"/>
+    <w:p>
+      <w:pPr>
+        <w:pStyle w:val="BodyText"/>
+      </w:pPr>
+      <w:r>
+        <w:t xml:space="preserve">The plan: Run partialAccum for a range of storm durations, set hopefully reasonable values for the variables to be held constant, and code up an FoS routine.</w:t>
+      </w:r>
+    </w:p>
+    <w:p>
+      <w:pPr>
+        <w:pStyle w:val="SourceCode"/>
+      </w:pPr>
+      <w:r>
+        <w:rPr>
+          <w:rStyle w:val="FunctionTok"/>
+        </w:rPr>
+        <w:t xml:space="preserve">library</w:t>
+      </w:r>
+      <w:r>
+        <w:rPr>
+          <w:rStyle w:val="NormalTok"/>
+        </w:rPr>
+        <w:t xml:space="preserve">(terra)</w:t>
+      </w:r>
+      <w:r>
+        <w:br/>
+      </w:r>
+      <w:r>
+        <w:rPr>
+          <w:rStyle w:val="CommentTok"/>
+        </w:rPr>
+        <w:t xml:space="preserve"># Get the FoS raster created with program PartialAccum for a 5-hour-duration storm.</w:t>
+      </w:r>
+      <w:r>
+        <w:br/>
+      </w:r>
+      <w:r>
+        <w:rPr>
+          <w:rStyle w:val="NormalTok"/>
+        </w:rPr>
+        <w:t xml:space="preserve">FoS_pca6 </w:t>
+      </w:r>
+      <w:r>
+        <w:rPr>
+          <w:rStyle w:val="OtherTok"/>
+        </w:rPr>
+        <w:t xml:space="preserve">&lt;-</w:t>
+      </w:r>
+      <w:r>
+        <w:rPr>
+          <w:rStyle w:val="NormalTok"/>
+        </w:rPr>
+        <w:t xml:space="preserve"> terra</w:t>
+      </w:r>
+      <w:r>
+        <w:rPr>
+          <w:rStyle w:val="SpecialCharTok"/>
+        </w:rPr>
+        <w:t xml:space="preserve">::</w:t>
+      </w:r>
+      <w:r>
+        <w:rPr>
+          <w:rStyle w:val="FunctionTok"/>
+        </w:rPr>
+        <w:t xml:space="preserve">rast</w:t>
+      </w:r>
+      <w:r>
+        <w:rPr>
+          <w:rStyle w:val="NormalTok"/>
+        </w:rPr>
+        <w:t xml:space="preserve">(</w:t>
+      </w:r>
+      <w:r>
+        <w:rPr>
+          <w:rStyle w:val="StringTok"/>
+        </w:rPr>
+        <w:t xml:space="preserve">"c:/work/data/wrangell/fos_pca6.flt"</w:t>
+      </w:r>
+      <w:r>
+        <w:rPr>
+          <w:rStyle w:val="NormalTok"/>
+        </w:rPr>
+        <w:t xml:space="preserve">)</w:t>
+      </w:r>
+      <w:r>
+        <w:br/>
+      </w:r>
+      <w:r>
+        <w:rPr>
+          <w:rStyle w:val="NormalTok"/>
+        </w:rPr>
+        <w:t xml:space="preserve">f </w:t>
+      </w:r>
+      <w:r>
+        <w:rPr>
+          <w:rStyle w:val="OtherTok"/>
+        </w:rPr>
+        <w:t xml:space="preserve">&lt;-</w:t>
+      </w:r>
+      <w:r>
+        <w:rPr>
+          <w:rStyle w:val="NormalTok"/>
+        </w:rPr>
+        <w:t xml:space="preserve"> </w:t>
+      </w:r>
+      <w:r>
+        <w:rPr>
+          <w:rStyle w:val="FunctionTok"/>
+        </w:rPr>
+        <w:t xml:space="preserve">as.data.table</w:t>
+      </w:r>
+      <w:r>
+        <w:rPr>
+          <w:rStyle w:val="NormalTok"/>
+        </w:rPr>
+        <w:t xml:space="preserve">(FoS_pca6) </w:t>
+      </w:r>
+      <w:r>
+        <w:br/>
+      </w:r>
+      <w:r>
+        <w:rPr>
+          <w:rStyle w:val="CommentTok"/>
+        </w:rPr>
+        <w:t xml:space="preserve"># Get the FoS values at the inventoried initiation points</w:t>
+      </w:r>
+      <w:r>
+        <w:br/>
+      </w:r>
+      <w:r>
+        <w:rPr>
+          <w:rStyle w:val="NormalTok"/>
+        </w:rPr>
+        <w:t xml:space="preserve">pnts </w:t>
+      </w:r>
+      <w:r>
+        <w:rPr>
+          <w:rStyle w:val="OtherTok"/>
+        </w:rPr>
+        <w:t xml:space="preserve">&lt;-</w:t>
+      </w:r>
+      <w:r>
+        <w:rPr>
+          <w:rStyle w:val="NormalTok"/>
+        </w:rPr>
+        <w:t xml:space="preserve"> terra</w:t>
+      </w:r>
+      <w:r>
+        <w:rPr>
+          <w:rStyle w:val="SpecialCharTok"/>
+        </w:rPr>
+        <w:t xml:space="preserve">::</w:t>
+      </w:r>
+      <w:r>
+        <w:rPr>
+          <w:rStyle w:val="FunctionTok"/>
+        </w:rPr>
+        <w:t xml:space="preserve">vect</w:t>
+      </w:r>
+      <w:r>
+        <w:rPr>
+          <w:rStyle w:val="NormalTok"/>
+        </w:rPr>
+        <w:t xml:space="preserve">(</w:t>
+      </w:r>
+      <w:r>
+        <w:rPr>
+          <w:rStyle w:val="StringTok"/>
+        </w:rPr>
+        <w:t xml:space="preserve">"c:/work/data/wrangell/LS_pnts.shp"</w:t>
+      </w:r>
+      <w:r>
+        <w:rPr>
+          <w:rStyle w:val="NormalTok"/>
+        </w:rPr>
+        <w:t xml:space="preserve">)</w:t>
+      </w:r>
+      <w:r>
+        <w:br/>
+      </w:r>
+      <w:r>
+        <w:rPr>
+          <w:rStyle w:val="NormalTok"/>
+        </w:rPr>
+        <w:t xml:space="preserve">ls </w:t>
+      </w:r>
+      <w:r>
+        <w:rPr>
+          <w:rStyle w:val="OtherTok"/>
+        </w:rPr>
+        <w:t xml:space="preserve">&lt;-</w:t>
+      </w:r>
+      <w:r>
+        <w:rPr>
+          <w:rStyle w:val="NormalTok"/>
+        </w:rPr>
+        <w:t xml:space="preserve"> terra</w:t>
+      </w:r>
+      <w:r>
+        <w:rPr>
+          <w:rStyle w:val="SpecialCharTok"/>
+        </w:rPr>
+        <w:t xml:space="preserve">::</w:t>
+      </w:r>
+      <w:r>
+        <w:rPr>
+          <w:rStyle w:val="FunctionTok"/>
+        </w:rPr>
+        <w:t xml:space="preserve">extract</w:t>
+      </w:r>
+      <w:r>
+        <w:rPr>
+          <w:rStyle w:val="NormalTok"/>
+        </w:rPr>
+        <w:t xml:space="preserve">(FoS_pca6,pnts)</w:t>
+      </w:r>
+      <w:r>
+        <w:br/>
+      </w:r>
+      <w:r>
+        <w:rPr>
+          <w:rStyle w:val="CommentTok"/>
+        </w:rPr>
+        <w:t xml:space="preserve"># Filter the raster FoS values to include only those less than the maximum </w:t>
+      </w:r>
+      <w:r>
+        <w:br/>
+      </w:r>
+      <w:r>
+        <w:rPr>
+          <w:rStyle w:val="CommentTok"/>
+        </w:rPr>
+        <w:t xml:space="preserve"># point value.</w:t>
+      </w:r>
+      <w:r>
+        <w:br/>
+      </w:r>
+      <w:r>
+        <w:rPr>
+          <w:rStyle w:val="NormalTok"/>
+        </w:rPr>
+        <w:t xml:space="preserve">maxls </w:t>
+      </w:r>
+      <w:r>
+        <w:rPr>
+          <w:rStyle w:val="OtherTok"/>
+        </w:rPr>
+        <w:t xml:space="preserve">&lt;-</w:t>
+      </w:r>
+      <w:r>
+        <w:rPr>
+          <w:rStyle w:val="NormalTok"/>
+        </w:rPr>
+        <w:t xml:space="preserve"> </w:t>
+      </w:r>
+      <w:r>
+        <w:rPr>
+          <w:rStyle w:val="FunctionTok"/>
+        </w:rPr>
+        <w:t xml:space="preserve">max</w:t>
+      </w:r>
+      <w:r>
+        <w:rPr>
+          <w:rStyle w:val="NormalTok"/>
+        </w:rPr>
+        <w:t xml:space="preserve">(ls</w:t>
+      </w:r>
+      <w:r>
+        <w:rPr>
+          <w:rStyle w:val="SpecialCharTok"/>
+        </w:rPr>
+        <w:t xml:space="preserve">$</w:t>
+      </w:r>
+      <w:r>
+        <w:rPr>
+          <w:rStyle w:val="NormalTok"/>
+        </w:rPr>
+        <w:t xml:space="preserve">fos_pca6)</w:t>
+      </w:r>
+      <w:r>
+        <w:br/>
+      </w:r>
+      <w:r>
+        <w:rPr>
+          <w:rStyle w:val="NormalTok"/>
+        </w:rPr>
+        <w:t xml:space="preserve">fsub </w:t>
+      </w:r>
+      <w:r>
+        <w:rPr>
+          <w:rStyle w:val="OtherTok"/>
+        </w:rPr>
+        <w:t xml:space="preserve">&lt;-</w:t>
+      </w:r>
+      <w:r>
+        <w:rPr>
+          <w:rStyle w:val="NormalTok"/>
+        </w:rPr>
+        <w:t xml:space="preserve"> </w:t>
+      </w:r>
+      <w:r>
+        <w:rPr>
+          <w:rStyle w:val="FunctionTok"/>
+        </w:rPr>
+        <w:t xml:space="preserve">subset</w:t>
+      </w:r>
+      <w:r>
+        <w:rPr>
+          <w:rStyle w:val="NormalTok"/>
+        </w:rPr>
+        <w:t xml:space="preserve">(f, fos_pca6 </w:t>
+      </w:r>
+      <w:r>
+        <w:rPr>
+          <w:rStyle w:val="SpecialCharTok"/>
+        </w:rPr>
+        <w:t xml:space="preserve">&lt;=</w:t>
+      </w:r>
+      <w:r>
+        <w:rPr>
+          <w:rStyle w:val="NormalTok"/>
+        </w:rPr>
+        <w:t xml:space="preserve"> maxls)</w:t>
+      </w:r>
+      <w:r>
+        <w:br/>
+      </w:r>
+      <w:r>
+        <w:rPr>
+          <w:rStyle w:val="NormalTok"/>
+        </w:rPr>
+        <w:t xml:space="preserve">f1 </w:t>
+      </w:r>
+      <w:r>
+        <w:rPr>
+          <w:rStyle w:val="OtherTok"/>
+        </w:rPr>
+        <w:t xml:space="preserve">&lt;-</w:t>
+      </w:r>
+      <w:r>
+        <w:rPr>
+          <w:rStyle w:val="NormalTok"/>
+        </w:rPr>
+        <w:t xml:space="preserve"> </w:t>
+      </w:r>
+      <w:r>
+        <w:rPr>
+          <w:rStyle w:val="FunctionTok"/>
+        </w:rPr>
+        <w:t xml:space="preserve">as.data.table</w:t>
+      </w:r>
+      <w:r>
+        <w:rPr>
+          <w:rStyle w:val="NormalTok"/>
+        </w:rPr>
+        <w:t xml:space="preserve">(fsub)</w:t>
+      </w:r>
+    </w:p>
+    <w:p>
+      <w:pPr>
+        <w:pStyle w:val="SourceCode"/>
+      </w:pPr>
+      <w:r>
+        <w:rPr>
+          <w:rStyle w:val="NormalTok"/>
+        </w:rPr>
+        <w:t xml:space="preserve">p1 </w:t>
+      </w:r>
+      <w:r>
+        <w:rPr>
+          <w:rStyle w:val="OtherTok"/>
+        </w:rPr>
+        <w:t xml:space="preserve">&lt;-</w:t>
+      </w:r>
+      <w:r>
+        <w:rPr>
+          <w:rStyle w:val="NormalTok"/>
+        </w:rPr>
+        <w:t xml:space="preserve"> </w:t>
+      </w:r>
+      <w:r>
+        <w:rPr>
+          <w:rStyle w:val="FunctionTok"/>
+        </w:rPr>
+        <w:t xml:space="preserve">ggplot</w:t>
+      </w:r>
+      <w:r>
+        <w:rPr>
+          <w:rStyle w:val="NormalTok"/>
+        </w:rPr>
+        <w:t xml:space="preserve">() </w:t>
+      </w:r>
+      <w:r>
+        <w:rPr>
+          <w:rStyle w:val="SpecialCharTok"/>
+        </w:rPr>
+        <w:t xml:space="preserve">+</w:t>
+      </w:r>
+      <w:r>
+        <w:rPr>
+          <w:rStyle w:val="NormalTok"/>
+        </w:rPr>
+        <w:t xml:space="preserve"> </w:t>
+      </w:r>
+      <w:r>
+        <w:br/>
+      </w:r>
+      <w:r>
+        <w:rPr>
+          <w:rStyle w:val="NormalTok"/>
+        </w:rPr>
+        <w:t xml:space="preserve">  </w:t>
+      </w:r>
+      <w:r>
+        <w:rPr>
+          <w:rStyle w:val="FunctionTok"/>
+        </w:rPr>
+        <w:t xml:space="preserve">geom_density</w:t>
+      </w:r>
+      <w:r>
+        <w:rPr>
+          <w:rStyle w:val="NormalTok"/>
+        </w:rPr>
+        <w:t xml:space="preserve">(</w:t>
+      </w:r>
+      <w:r>
+        <w:rPr>
+          <w:rStyle w:val="AttributeTok"/>
+        </w:rPr>
+        <w:t xml:space="preserve">data=</w:t>
+      </w:r>
+      <w:r>
+        <w:rPr>
+          <w:rStyle w:val="NormalTok"/>
+        </w:rPr>
+        <w:t xml:space="preserve">f1, </w:t>
+      </w:r>
+      <w:r>
+        <w:rPr>
+          <w:rStyle w:val="FunctionTok"/>
+        </w:rPr>
+        <w:t xml:space="preserve">aes</w:t>
+      </w:r>
+      <w:r>
+        <w:rPr>
+          <w:rStyle w:val="NormalTok"/>
+        </w:rPr>
+        <w:t xml:space="preserve">(</w:t>
+      </w:r>
+      <w:r>
+        <w:rPr>
+          <w:rStyle w:val="AttributeTok"/>
+        </w:rPr>
+        <w:t xml:space="preserve">x=</w:t>
+      </w:r>
+      <w:r>
+        <w:rPr>
+          <w:rStyle w:val="NormalTok"/>
+        </w:rPr>
+        <w:t xml:space="preserve">fos_pca6, </w:t>
+      </w:r>
+      <w:r>
+        <w:rPr>
+          <w:rStyle w:val="AttributeTok"/>
+        </w:rPr>
+        <w:t xml:space="preserve">fill =</w:t>
+      </w:r>
+      <w:r>
+        <w:rPr>
+          <w:rStyle w:val="NormalTok"/>
+        </w:rPr>
+        <w:t xml:space="preserve"> </w:t>
+      </w:r>
+      <w:r>
+        <w:rPr>
+          <w:rStyle w:val="StringTok"/>
+        </w:rPr>
+        <w:t xml:space="preserve">'DEM'</w:t>
+      </w:r>
+      <w:r>
+        <w:rPr>
+          <w:rStyle w:val="NormalTok"/>
+        </w:rPr>
+        <w:t xml:space="preserve">), </w:t>
+      </w:r>
+      <w:r>
+        <w:rPr>
+          <w:rStyle w:val="AttributeTok"/>
+        </w:rPr>
+        <w:t xml:space="preserve">alpha=</w:t>
+      </w:r>
+      <w:r>
+        <w:rPr>
+          <w:rStyle w:val="FloatTok"/>
+        </w:rPr>
+        <w:t xml:space="preserve">0.5</w:t>
+      </w:r>
+      <w:r>
+        <w:rPr>
+          <w:rStyle w:val="NormalTok"/>
+        </w:rPr>
+        <w:t xml:space="preserve">) </w:t>
+      </w:r>
+      <w:r>
+        <w:rPr>
+          <w:rStyle w:val="SpecialCharTok"/>
+        </w:rPr>
+        <w:t xml:space="preserve">+</w:t>
+      </w:r>
+      <w:r>
+        <w:br/>
+      </w:r>
+      <w:r>
+        <w:rPr>
+          <w:rStyle w:val="NormalTok"/>
+        </w:rPr>
+        <w:t xml:space="preserve">  </w:t>
+      </w:r>
+      <w:r>
+        <w:rPr>
+          <w:rStyle w:val="FunctionTok"/>
+        </w:rPr>
+        <w:t xml:space="preserve">geom_density</w:t>
+      </w:r>
+      <w:r>
+        <w:rPr>
+          <w:rStyle w:val="NormalTok"/>
+        </w:rPr>
+        <w:t xml:space="preserve">(</w:t>
+      </w:r>
+      <w:r>
+        <w:rPr>
+          <w:rStyle w:val="AttributeTok"/>
+        </w:rPr>
+        <w:t xml:space="preserve">data=</w:t>
+      </w:r>
+      <w:r>
+        <w:rPr>
+          <w:rStyle w:val="NormalTok"/>
+        </w:rPr>
+        <w:t xml:space="preserve">ls, </w:t>
+      </w:r>
+      <w:r>
+        <w:rPr>
+          <w:rStyle w:val="FunctionTok"/>
+        </w:rPr>
+        <w:t xml:space="preserve">aes</w:t>
+      </w:r>
+      <w:r>
+        <w:rPr>
+          <w:rStyle w:val="NormalTok"/>
+        </w:rPr>
+        <w:t xml:space="preserve">(</w:t>
+      </w:r>
+      <w:r>
+        <w:rPr>
+          <w:rStyle w:val="AttributeTok"/>
+        </w:rPr>
+        <w:t xml:space="preserve">x=</w:t>
+      </w:r>
+      <w:r>
+        <w:rPr>
+          <w:rStyle w:val="NormalTok"/>
+        </w:rPr>
+        <w:t xml:space="preserve">fos_pca6, </w:t>
+      </w:r>
+      <w:r>
+        <w:rPr>
+          <w:rStyle w:val="AttributeTok"/>
+        </w:rPr>
+        <w:t xml:space="preserve">fill =</w:t>
+      </w:r>
+      <w:r>
+        <w:rPr>
+          <w:rStyle w:val="NormalTok"/>
+        </w:rPr>
+        <w:t xml:space="preserve"> </w:t>
+      </w:r>
+      <w:r>
+        <w:rPr>
+          <w:rStyle w:val="StringTok"/>
+        </w:rPr>
+        <w:t xml:space="preserve">'Landslides'</w:t>
+      </w:r>
+      <w:r>
+        <w:rPr>
+          <w:rStyle w:val="NormalTok"/>
+        </w:rPr>
+        <w:t xml:space="preserve">), </w:t>
+      </w:r>
+      <w:r>
+        <w:rPr>
+          <w:rStyle w:val="AttributeTok"/>
+        </w:rPr>
+        <w:t xml:space="preserve">alpha=</w:t>
+      </w:r>
+      <w:r>
+        <w:rPr>
+          <w:rStyle w:val="FloatTok"/>
+        </w:rPr>
+        <w:t xml:space="preserve">0.5</w:t>
+      </w:r>
+      <w:r>
+        <w:rPr>
+          <w:rStyle w:val="NormalTok"/>
+        </w:rPr>
+        <w:t xml:space="preserve">) </w:t>
+      </w:r>
+      <w:r>
+        <w:rPr>
+          <w:rStyle w:val="SpecialCharTok"/>
+        </w:rPr>
+        <w:t xml:space="preserve">+</w:t>
+      </w:r>
+      <w:r>
+        <w:br/>
+      </w:r>
+      <w:r>
+        <w:rPr>
+          <w:rStyle w:val="NormalTok"/>
+        </w:rPr>
+        <w:t xml:space="preserve">  </w:t>
+      </w:r>
+      <w:r>
+        <w:rPr>
+          <w:rStyle w:val="FunctionTok"/>
+        </w:rPr>
+        <w:t xml:space="preserve">scale_fill_manual</w:t>
+      </w:r>
+      <w:r>
+        <w:rPr>
+          <w:rStyle w:val="NormalTok"/>
+        </w:rPr>
+        <w:t xml:space="preserve">(</w:t>
+      </w:r>
+      <w:r>
+        <w:rPr>
+          <w:rStyle w:val="AttributeTok"/>
+        </w:rPr>
+        <w:t xml:space="preserve">name =</w:t>
+      </w:r>
+      <w:r>
+        <w:rPr>
+          <w:rStyle w:val="NormalTok"/>
+        </w:rPr>
+        <w:t xml:space="preserve"> </w:t>
+      </w:r>
+      <w:r>
+        <w:rPr>
+          <w:rStyle w:val="StringTok"/>
+        </w:rPr>
+        <w:t xml:space="preserve">""</w:t>
+      </w:r>
+      <w:r>
+        <w:rPr>
+          <w:rStyle w:val="NormalTok"/>
+        </w:rPr>
+        <w:t xml:space="preserve">, </w:t>
+      </w:r>
+      <w:r>
+        <w:rPr>
+          <w:rStyle w:val="AttributeTok"/>
+        </w:rPr>
+        <w:t xml:space="preserve">values =</w:t>
+      </w:r>
+      <w:r>
+        <w:rPr>
+          <w:rStyle w:val="NormalTok"/>
+        </w:rPr>
+        <w:t xml:space="preserve"> </w:t>
+      </w:r>
+      <w:r>
+        <w:rPr>
+          <w:rStyle w:val="FunctionTok"/>
+        </w:rPr>
+        <w:t xml:space="preserve">c</w:t>
+      </w:r>
+      <w:r>
+        <w:rPr>
+          <w:rStyle w:val="NormalTok"/>
+        </w:rPr>
+        <w:t xml:space="preserve">(</w:t>
+      </w:r>
+      <w:r>
+        <w:rPr>
+          <w:rStyle w:val="AttributeTok"/>
+        </w:rPr>
+        <w:t xml:space="preserve">DEM =</w:t>
+      </w:r>
+      <w:r>
+        <w:rPr>
+          <w:rStyle w:val="NormalTok"/>
+        </w:rPr>
+        <w:t xml:space="preserve"> </w:t>
+      </w:r>
+      <w:r>
+        <w:rPr>
+          <w:rStyle w:val="StringTok"/>
+        </w:rPr>
+        <w:t xml:space="preserve">'blue'</w:t>
+      </w:r>
+      <w:r>
+        <w:rPr>
+          <w:rStyle w:val="NormalTok"/>
+        </w:rPr>
+        <w:t xml:space="preserve">, </w:t>
+      </w:r>
+      <w:r>
+        <w:rPr>
+          <w:rStyle w:val="AttributeTok"/>
+        </w:rPr>
+        <w:t xml:space="preserve">Landslides =</w:t>
+      </w:r>
+      <w:r>
+        <w:rPr>
+          <w:rStyle w:val="NormalTok"/>
+        </w:rPr>
+        <w:t xml:space="preserve"> </w:t>
+      </w:r>
+      <w:r>
+        <w:rPr>
+          <w:rStyle w:val="StringTok"/>
+        </w:rPr>
+        <w:t xml:space="preserve">'red'</w:t>
+      </w:r>
+      <w:r>
+        <w:rPr>
+          <w:rStyle w:val="NormalTok"/>
+        </w:rPr>
+        <w:t xml:space="preserve">)) </w:t>
+      </w:r>
+      <w:r>
+        <w:rPr>
+          <w:rStyle w:val="SpecialCharTok"/>
+        </w:rPr>
+        <w:t xml:space="preserve">+</w:t>
+      </w:r>
+      <w:r>
+        <w:br/>
+      </w:r>
+      <w:r>
+        <w:rPr>
+          <w:rStyle w:val="NormalTok"/>
+        </w:rPr>
+        <w:t xml:space="preserve">  </w:t>
+      </w:r>
+      <w:r>
+        <w:rPr>
+          <w:rStyle w:val="FunctionTok"/>
+        </w:rPr>
+        <w:t xml:space="preserve">labs</w:t>
+      </w:r>
+      <w:r>
+        <w:rPr>
+          <w:rStyle w:val="NormalTok"/>
+        </w:rPr>
+        <w:t xml:space="preserve">(</w:t>
+      </w:r>
+      <w:r>
+        <w:br/>
+      </w:r>
+      <w:r>
+        <w:rPr>
+          <w:rStyle w:val="NormalTok"/>
+        </w:rPr>
+        <w:t xml:space="preserve">    </w:t>
+      </w:r>
+      <w:r>
+        <w:rPr>
+          <w:rStyle w:val="AttributeTok"/>
+        </w:rPr>
+        <w:t xml:space="preserve">x =</w:t>
+      </w:r>
+      <w:r>
+        <w:rPr>
+          <w:rStyle w:val="NormalTok"/>
+        </w:rPr>
+        <w:t xml:space="preserve"> </w:t>
+      </w:r>
+      <w:r>
+        <w:rPr>
+          <w:rStyle w:val="StringTok"/>
+        </w:rPr>
+        <w:t xml:space="preserve">"Factor of Safety"</w:t>
+      </w:r>
+      <w:r>
+        <w:rPr>
+          <w:rStyle w:val="NormalTok"/>
+        </w:rPr>
+        <w:t xml:space="preserve">,</w:t>
+      </w:r>
+      <w:r>
+        <w:br/>
+      </w:r>
+      <w:r>
+        <w:rPr>
+          <w:rStyle w:val="NormalTok"/>
+        </w:rPr>
+        <w:t xml:space="preserve">    </w:t>
+      </w:r>
+      <w:r>
+        <w:rPr>
+          <w:rStyle w:val="AttributeTok"/>
+        </w:rPr>
+        <w:t xml:space="preserve">y =</w:t>
+      </w:r>
+      <w:r>
+        <w:rPr>
+          <w:rStyle w:val="NormalTok"/>
+        </w:rPr>
+        <w:t xml:space="preserve"> </w:t>
+      </w:r>
+      <w:r>
+        <w:rPr>
+          <w:rStyle w:val="StringTok"/>
+        </w:rPr>
+        <w:t xml:space="preserve">"Density"</w:t>
+      </w:r>
+      <w:r>
+        <w:rPr>
+          <w:rStyle w:val="NormalTok"/>
+        </w:rPr>
+        <w:t xml:space="preserve">,</w:t>
+      </w:r>
+      <w:r>
+        <w:br/>
+      </w:r>
+      <w:r>
+        <w:rPr>
+          <w:rStyle w:val="NormalTok"/>
+        </w:rPr>
+        <w:t xml:space="preserve">    </w:t>
+      </w:r>
+      <w:r>
+        <w:rPr>
+          <w:rStyle w:val="AttributeTok"/>
+        </w:rPr>
+        <w:t xml:space="preserve">title =</w:t>
+      </w:r>
+      <w:r>
+        <w:rPr>
+          <w:rStyle w:val="NormalTok"/>
+        </w:rPr>
+        <w:t xml:space="preserve"> </w:t>
+      </w:r>
+      <w:r>
+        <w:rPr>
+          <w:rStyle w:val="StringTok"/>
+        </w:rPr>
+        <w:t xml:space="preserve">"Wrangell"</w:t>
+      </w:r>
+      <w:r>
+        <w:rPr>
+          <w:rStyle w:val="NormalTok"/>
+        </w:rPr>
+        <w:t xml:space="preserve">,</w:t>
+      </w:r>
+      <w:r>
+        <w:br/>
+      </w:r>
+      <w:r>
+        <w:rPr>
+          <w:rStyle w:val="NormalTok"/>
+        </w:rPr>
+        <w:t xml:space="preserve">    </w:t>
+      </w:r>
+      <w:r>
+        <w:rPr>
+          <w:rStyle w:val="AttributeTok"/>
+        </w:rPr>
+        <w:t xml:space="preserve">subtitle =</w:t>
+      </w:r>
+      <w:r>
+        <w:rPr>
+          <w:rStyle w:val="NormalTok"/>
+        </w:rPr>
+        <w:t xml:space="preserve"> </w:t>
+      </w:r>
+      <w:r>
+        <w:rPr>
+          <w:rStyle w:val="StringTok"/>
+        </w:rPr>
+        <w:t xml:space="preserve">"Storm duration = 5hr"</w:t>
+      </w:r>
+      <w:r>
+        <w:rPr>
+          <w:rStyle w:val="NormalTok"/>
+        </w:rPr>
+        <w:t xml:space="preserve">) </w:t>
+      </w:r>
+      <w:r>
+        <w:rPr>
+          <w:rStyle w:val="SpecialCharTok"/>
+        </w:rPr>
+        <w:t xml:space="preserve">+</w:t>
+      </w:r>
+      <w:r>
+        <w:br/>
+      </w:r>
+      <w:r>
+        <w:rPr>
+          <w:rStyle w:val="NormalTok"/>
+        </w:rPr>
+        <w:t xml:space="preserve">  </w:t>
+      </w:r>
+      <w:r>
+        <w:rPr>
+          <w:rStyle w:val="FunctionTok"/>
+        </w:rPr>
+        <w:t xml:space="preserve">theme</w:t>
+      </w:r>
+      <w:r>
+        <w:rPr>
+          <w:rStyle w:val="NormalTok"/>
+        </w:rPr>
+        <w:t xml:space="preserve">(</w:t>
+      </w:r>
+      <w:r>
+        <w:rPr>
+          <w:rStyle w:val="AttributeTok"/>
+        </w:rPr>
+        <w:t xml:space="preserve">legend.position =</w:t>
+      </w:r>
+      <w:r>
+        <w:rPr>
+          <w:rStyle w:val="NormalTok"/>
+        </w:rPr>
+        <w:t xml:space="preserve"> </w:t>
+      </w:r>
+      <w:r>
+        <w:rPr>
+          <w:rStyle w:val="StringTok"/>
+        </w:rPr>
+        <w:t xml:space="preserve">"inside"</w:t>
+      </w:r>
+      <w:r>
+        <w:rPr>
+          <w:rStyle w:val="NormalTok"/>
+        </w:rPr>
+        <w:t xml:space="preserve">, </w:t>
+      </w:r>
+      <w:r>
+        <w:rPr>
+          <w:rStyle w:val="AttributeTok"/>
+        </w:rPr>
+        <w:t xml:space="preserve">legend.position.inside =</w:t>
+      </w:r>
+      <w:r>
+        <w:rPr>
+          <w:rStyle w:val="NormalTok"/>
+        </w:rPr>
+        <w:t xml:space="preserve"> </w:t>
+      </w:r>
+      <w:r>
+        <w:rPr>
+          <w:rStyle w:val="FunctionTok"/>
+        </w:rPr>
+        <w:t xml:space="preserve">c</w:t>
+      </w:r>
+      <w:r>
+        <w:rPr>
+          <w:rStyle w:val="NormalTok"/>
+        </w:rPr>
+        <w:t xml:space="preserve">(</w:t>
+      </w:r>
+      <w:r>
+        <w:rPr>
+          <w:rStyle w:val="FloatTok"/>
+        </w:rPr>
+        <w:t xml:space="preserve">0.6</w:t>
+      </w:r>
+      <w:r>
+        <w:rPr>
+          <w:rStyle w:val="NormalTok"/>
+        </w:rPr>
+        <w:t xml:space="preserve">, </w:t>
+      </w:r>
+      <w:r>
+        <w:rPr>
+          <w:rStyle w:val="FloatTok"/>
+        </w:rPr>
+        <w:t xml:space="preserve">0.8</w:t>
+      </w:r>
+      <w:r>
+        <w:rPr>
+          <w:rStyle w:val="NormalTok"/>
+        </w:rPr>
+        <w:t xml:space="preserve">))</w:t>
+      </w:r>
+      <w:r>
+        <w:br/>
+      </w:r>
+      <w:r>
+        <w:rPr>
+          <w:rStyle w:val="NormalTok"/>
+        </w:rPr>
+        <w:t xml:space="preserve">  </w:t>
+      </w:r>
+      <w:r>
+        <w:br/>
+      </w:r>
+      <w:r>
+        <w:rPr>
+          <w:rStyle w:val="NormalTok"/>
+        </w:rPr>
+        <w:t xml:space="preserve">p1</w:t>
+      </w:r>
+    </w:p>
+    <w:p>
+      <w:pPr>
+        <w:pStyle w:val="FirstParagraph"/>
+      </w:pPr>
+      <w:r>
+        <w:drawing>
+          <wp:inline>
+            <wp:extent cx="4620126" cy="3696101"/>
+            <wp:effectExtent b="0" l="0" r="0" t="0"/>
+            <wp:docPr descr="" title="" id="28" name="Picture"/>
+            <a:graphic>
+              <a:graphicData uri="http://schemas.openxmlformats.org/drawingml/2006/picture">
+                <pic:pic>
+                  <pic:nvPicPr>
+                    <pic:cNvPr descr="FoS_files/figure-docx/unnamed-chunk-4-1.png" id="29" name="Picture"/>
+                    <pic:cNvPicPr>
+                      <a:picLocks noChangeArrowheads="1" noChangeAspect="1"/>
+                    </pic:cNvPicPr>
+                  </pic:nvPicPr>
+                  <pic:blipFill>
+                    <a:blip r:embed="rId27"/>
+                    <a:stretch>
+                      <a:fillRect/>
+                    </a:stretch>
+                  </pic:blipFill>
+                  <pic:spPr bwMode="auto">
+                    <a:xfrm>
+                      <a:off x="0" y="0"/>
+                      <a:ext cx="4620126" cy="3696101"/>
+                    </a:xfrm>
+                    <a:prstGeom prst="rect">
+                      <a:avLst/>
+                    </a:prstGeom>
+                    <a:noFill/>
+                    <a:ln w="9525">
+                      <a:noFill/>
+                      <a:headEnd/>
+                      <a:tailEnd/>
+                    </a:ln>
+                  </pic:spPr>
+                </pic:pic>
+              </a:graphicData>
+            </a:graphic>
+          </wp:inline>
+        </w:drawing>
+      </w:r>
+    </w:p>
+    <w:bookmarkStart w:id="36" w:name="refs"/>
+    <w:bookmarkStart w:id="30" w:name="ref-dietrich2001"/>
     <w:p>
       <w:pPr>
         <w:pStyle w:val="Bibliography"/>
@@ -4255,8 +5861,8 @@
         <w:t xml:space="preserve">In, edited by M. S. Wigmosta and S. J. Burges, 195–227. Washington, D.C.: American Geophysical Union.</w:t>
       </w:r>
     </w:p>
-    <w:bookmarkEnd w:id="27"/>
-    <w:bookmarkStart w:id="29" w:name="ref-iverson2000a"/>
+    <w:bookmarkEnd w:id="30"/>
+    <w:bookmarkStart w:id="32" w:name="ref-iverson2000a"/>
     <w:p>
       <w:pPr>
         <w:pStyle w:val="Bibliography"/>
@@ -4289,7 +5895,7 @@
       <w:r>
         <w:t xml:space="preserve"> </w:t>
       </w:r>
-      <w:hyperlink r:id="rId28">
+      <w:hyperlink r:id="rId31">
         <w:r>
           <w:rPr>
             <w:rStyle w:val="Hyperlink"/>
@@ -4301,8 +5907,8 @@
         <w:t xml:space="preserve">.</w:t>
       </w:r>
     </w:p>
-    <w:bookmarkEnd w:id="29"/>
-    <w:bookmarkStart w:id="31" w:name="ref-montgomery1994"/>
+    <w:bookmarkEnd w:id="32"/>
+    <w:bookmarkStart w:id="34" w:name="ref-montgomery1994"/>
     <w:p>
       <w:pPr>
         <w:pStyle w:val="Bibliography"/>
@@ -4335,7 +5941,7 @@
       <w:r>
         <w:t xml:space="preserve"> </w:t>
       </w:r>
-      <w:hyperlink r:id="rId30">
+      <w:hyperlink r:id="rId33">
         <w:r>
           <w:rPr>
             <w:rStyle w:val="Hyperlink"/>
@@ -4347,8 +5953,8 @@
         <w:t xml:space="preserve">.</w:t>
       </w:r>
     </w:p>
-    <w:bookmarkEnd w:id="31"/>
-    <w:bookmarkStart w:id="32" w:name="ref-skempton1957"/>
+    <w:bookmarkEnd w:id="34"/>
+    <w:bookmarkStart w:id="35" w:name="ref-skempton1957"/>
     <w:p>
       <w:pPr>
         <w:pStyle w:val="Bibliography"/>
@@ -4363,8 +5969,8 @@
         <w:t xml:space="preserve">“Stability of Natural Slopes in London Clay.”</w:t>
       </w:r>
     </w:p>
-    <w:bookmarkEnd w:id="32"/>
-    <w:bookmarkEnd w:id="33"/>
+    <w:bookmarkEnd w:id="35"/>
+    <w:bookmarkEnd w:id="36"/>
     <w:sectPr>
       <w:footnotePr>
         <w:numRestart w:val="eachSect"/>

</xml_diff>